<commit_message>
Expand final delivery docs for stakeholder review
</commit_message>
<xml_diff>
--- a/docs/final-delivery/Energy Management System Reports and KPI Reports.docx
+++ b/docs/final-delivery/Energy Management System Reports and KPI Reports.docx
@@ -38,13 +38,13 @@
         <w:tblLook w:firstColumn="1" w:firstRow="1" w:lastColumn="0" w:lastRow="0" w:noHBand="0" w:noVBand="1" w:val="04A0"/>
       </w:tblPr>
       <w:tblGrid>
-        <w:gridCol w:w="5184"/>
-        <w:gridCol w:w="5184"/>
+        <w:gridCol w:w="5328"/>
+        <w:gridCol w:w="5328"/>
       </w:tblGrid>
       <w:tr>
         <w:tc>
           <w:tcPr>
-            <w:tcW w:type="dxa" w:w="5184"/>
+            <w:tcW w:type="dxa" w:w="5328"/>
             <w:vAlign w:val="top"/>
             <w:shd w:fill="E2E8F0"/>
           </w:tcPr>
@@ -61,7 +61,7 @@
         </w:tc>
         <w:tc>
           <w:tcPr>
-            <w:tcW w:type="dxa" w:w="5184"/>
+            <w:tcW w:type="dxa" w:w="5328"/>
             <w:vAlign w:val="top"/>
           </w:tcPr>
           <w:p>
@@ -71,7 +71,7 @@
                 <w:b w:val="0"/>
                 <w:sz w:val="17"/>
               </w:rPr>
-              <w:t>1.0</w:t>
+              <w:t>1.1</w:t>
             </w:r>
           </w:p>
         </w:tc>
@@ -79,7 +79,7 @@
       <w:tr>
         <w:tc>
           <w:tcPr>
-            <w:tcW w:type="dxa" w:w="5184"/>
+            <w:tcW w:type="dxa" w:w="5328"/>
             <w:vAlign w:val="top"/>
             <w:shd w:fill="E2E8F0"/>
           </w:tcPr>
@@ -96,7 +96,7 @@
         </w:tc>
         <w:tc>
           <w:tcPr>
-            <w:tcW w:type="dxa" w:w="5184"/>
+            <w:tcW w:type="dxa" w:w="5328"/>
             <w:vAlign w:val="top"/>
           </w:tcPr>
           <w:p>
@@ -106,7 +106,7 @@
                 <w:b w:val="0"/>
                 <w:sz w:val="17"/>
               </w:rPr>
-              <w:t>2026-06-08</w:t>
+              <w:t>2026-06-09</w:t>
             </w:r>
           </w:p>
         </w:tc>
@@ -114,7 +114,7 @@
       <w:tr>
         <w:tc>
           <w:tcPr>
-            <w:tcW w:type="dxa" w:w="5184"/>
+            <w:tcW w:type="dxa" w:w="5328"/>
             <w:vAlign w:val="top"/>
             <w:shd w:fill="E2E8F0"/>
           </w:tcPr>
@@ -131,7 +131,7 @@
         </w:tc>
         <w:tc>
           <w:tcPr>
-            <w:tcW w:type="dxa" w:w="5184"/>
+            <w:tcW w:type="dxa" w:w="5328"/>
             <w:vAlign w:val="top"/>
           </w:tcPr>
           <w:p>
@@ -141,7 +141,7 @@
                 <w:b w:val="0"/>
                 <w:sz w:val="17"/>
               </w:rPr>
-              <w:t>Final delivery documentation package</w:t>
+              <w:t>Final stakeholder-ready documentation package</w:t>
             </w:r>
           </w:p>
         </w:tc>
@@ -149,7 +149,7 @@
       <w:tr>
         <w:tc>
           <w:tcPr>
-            <w:tcW w:type="dxa" w:w="5184"/>
+            <w:tcW w:type="dxa" w:w="5328"/>
             <w:vAlign w:val="top"/>
             <w:shd w:fill="E2E8F0"/>
           </w:tcPr>
@@ -166,7 +166,7 @@
         </w:tc>
         <w:tc>
           <w:tcPr>
-            <w:tcW w:type="dxa" w:w="5184"/>
+            <w:tcW w:type="dxa" w:w="5328"/>
             <w:vAlign w:val="top"/>
           </w:tcPr>
           <w:p>
@@ -184,7 +184,7 @@
       <w:tr>
         <w:tc>
           <w:tcPr>
-            <w:tcW w:type="dxa" w:w="5184"/>
+            <w:tcW w:type="dxa" w:w="5328"/>
             <w:vAlign w:val="top"/>
             <w:shd w:fill="E2E8F0"/>
           </w:tcPr>
@@ -201,7 +201,7 @@
         </w:tc>
         <w:tc>
           <w:tcPr>
-            <w:tcW w:type="dxa" w:w="5184"/>
+            <w:tcW w:type="dxa" w:w="5328"/>
             <w:vAlign w:val="top"/>
           </w:tcPr>
           <w:p>
@@ -226,7 +226,7 @@
         <w:rPr>
           <w:b/>
         </w:rPr>
-        <w:t xml:space="preserve">Evidence rule: </w:t>
+        <w:t xml:space="preserve">Source basis: </w:t>
       </w:r>
       <w:r>
         <w:t>KPI formulas are included only where defined in SQL functions, code, dashboard queries, or existing local documentation.</w:t>
@@ -257,37 +257,62 @@
     </w:p>
     <w:p>
       <w:r>
-        <w:t>3. Analytics Endpoints And Modules</w:t>
+        <w:t>3. KPI Catalog And Classification</w:t>
       </w:r>
     </w:p>
     <w:p>
       <w:r>
-        <w:t>4. Grafana Dashboard Capabilities</w:t>
+        <w:t>4. Analytics Endpoints And Modules</w:t>
       </w:r>
     </w:p>
     <w:p>
       <w:r>
-        <w:t>5. Node-RED Ingestion Pipeline</w:t>
+        <w:t>5. Grafana Dashboard Capabilities</w:t>
       </w:r>
     </w:p>
     <w:p>
       <w:r>
-        <w:t>6. Report Generation Capabilities</w:t>
+        <w:t>6. Dashboard Interpretation Notes</w:t>
       </w:r>
     </w:p>
     <w:p>
       <w:r>
-        <w:t>7. Implemented, Configured, Partial, And Demo Data Distinctions</w:t>
+        <w:t>7. Node-RED Ingestion Pipeline</w:t>
       </w:r>
     </w:p>
     <w:p>
       <w:r>
-        <w:t>8. Limitations And Assumptions</w:t>
+        <w:t>8. Report Generation Capabilities</w:t>
       </w:r>
     </w:p>
     <w:p>
       <w:r>
-        <w:t>9. Evidence References</w:t>
+        <w:t>9. Report Workflow</w:t>
+      </w:r>
+    </w:p>
+    <w:p>
+      <w:r>
+        <w:t>10. Data-Quality Assumptions</w:t>
+      </w:r>
+    </w:p>
+    <w:p>
+      <w:r>
+        <w:t>11. Audit-Use Cautions</w:t>
+      </w:r>
+    </w:p>
+    <w:p>
+      <w:r>
+        <w:t>12. Implemented, Configured, Partial, And Demo Data Distinctions</w:t>
+      </w:r>
+    </w:p>
+    <w:p>
+      <w:r>
+        <w:t>13. Limitations And Assumptions</w:t>
+      </w:r>
+    </w:p>
+    <w:p>
+      <w:r>
+        <w:t>14. Source References</w:t>
       </w:r>
     </w:p>
     <w:p>
@@ -307,7 +332,7 @@
       <w:r>
         <w:drawing>
           <wp:inline xmlns:a="http://schemas.openxmlformats.org/drawingml/2006/main" xmlns:pic="http://schemas.openxmlformats.org/drawingml/2006/picture">
-            <wp:extent cx="6126480" cy="3675888"/>
+            <wp:extent cx="6583680" cy="3950208"/>
             <wp:docPr id="1" name="Picture 1"/>
             <wp:cNvGraphicFramePr>
               <a:graphicFrameLocks noChangeAspect="1"/>
@@ -328,7 +353,7 @@
                   <pic:spPr>
                     <a:xfrm>
                       <a:off x="0" y="0"/>
-                      <a:ext cx="6126480" cy="3675888"/>
+                      <a:ext cx="6583680" cy="3950208"/>
                     </a:xfrm>
                     <a:prstGeom prst="rect"/>
                   </pic:spPr>
@@ -369,17 +394,18 @@
         <w:tblLook w:firstColumn="1" w:firstRow="1" w:lastColumn="0" w:lastRow="0" w:noHBand="0" w:noVBand="1" w:val="04A0"/>
       </w:tblPr>
       <w:tblGrid>
-        <w:gridCol w:w="3456"/>
-        <w:gridCol w:w="3456"/>
-        <w:gridCol w:w="3456"/>
+        <w:gridCol w:w="3552"/>
+        <w:gridCol w:w="3552"/>
+        <w:gridCol w:w="3552"/>
       </w:tblGrid>
       <w:tr>
         <w:trPr>
           <w:tblHeader w:val="true"/>
+          <w:cantSplit/>
         </w:trPr>
         <w:tc>
           <w:tcPr>
-            <w:tcW w:type="dxa" w:w="3456"/>
+            <w:tcW w:type="dxa" w:w="3552"/>
             <w:vAlign w:val="top"/>
             <w:shd w:fill="D9EAF7"/>
           </w:tcPr>
@@ -396,7 +422,7 @@
         </w:tc>
         <w:tc>
           <w:tcPr>
-            <w:tcW w:type="dxa" w:w="3456"/>
+            <w:tcW w:type="dxa" w:w="3552"/>
             <w:vAlign w:val="top"/>
             <w:shd w:fill="D9EAF7"/>
           </w:tcPr>
@@ -413,7 +439,7 @@
         </w:tc>
         <w:tc>
           <w:tcPr>
-            <w:tcW w:type="dxa" w:w="3456"/>
+            <w:tcW w:type="dxa" w:w="3552"/>
             <w:vAlign w:val="top"/>
             <w:shd w:fill="D9EAF7"/>
           </w:tcPr>
@@ -430,9 +456,12 @@
         </w:tc>
       </w:tr>
       <w:tr>
+        <w:trPr>
+          <w:cantSplit/>
+        </w:trPr>
         <w:tc>
           <w:tcPr>
-            <w:tcW w:type="dxa" w:w="3456"/>
+            <w:tcW w:type="dxa" w:w="3552"/>
             <w:vAlign w:val="top"/>
           </w:tcPr>
           <w:p>
@@ -448,7 +477,7 @@
         </w:tc>
         <w:tc>
           <w:tcPr>
-            <w:tcW w:type="dxa" w:w="3456"/>
+            <w:tcW w:type="dxa" w:w="3552"/>
             <w:vAlign w:val="top"/>
           </w:tcPr>
           <w:p>
@@ -464,7 +493,7 @@
         </w:tc>
         <w:tc>
           <w:tcPr>
-            <w:tcW w:type="dxa" w:w="3456"/>
+            <w:tcW w:type="dxa" w:w="3552"/>
             <w:vAlign w:val="top"/>
           </w:tcPr>
           <w:p>
@@ -480,9 +509,12 @@
         </w:tc>
       </w:tr>
       <w:tr>
+        <w:trPr>
+          <w:cantSplit/>
+        </w:trPr>
         <w:tc>
           <w:tcPr>
-            <w:tcW w:type="dxa" w:w="3456"/>
+            <w:tcW w:type="dxa" w:w="3552"/>
             <w:vAlign w:val="top"/>
           </w:tcPr>
           <w:p>
@@ -498,7 +530,7 @@
         </w:tc>
         <w:tc>
           <w:tcPr>
-            <w:tcW w:type="dxa" w:w="3456"/>
+            <w:tcW w:type="dxa" w:w="3552"/>
             <w:vAlign w:val="top"/>
           </w:tcPr>
           <w:p>
@@ -514,7 +546,7 @@
         </w:tc>
         <w:tc>
           <w:tcPr>
-            <w:tcW w:type="dxa" w:w="3456"/>
+            <w:tcW w:type="dxa" w:w="3552"/>
             <w:vAlign w:val="top"/>
           </w:tcPr>
           <w:p>
@@ -530,9 +562,12 @@
         </w:tc>
       </w:tr>
       <w:tr>
+        <w:trPr>
+          <w:cantSplit/>
+        </w:trPr>
         <w:tc>
           <w:tcPr>
-            <w:tcW w:type="dxa" w:w="3456"/>
+            <w:tcW w:type="dxa" w:w="3552"/>
             <w:vAlign w:val="top"/>
           </w:tcPr>
           <w:p>
@@ -548,7 +583,7 @@
         </w:tc>
         <w:tc>
           <w:tcPr>
-            <w:tcW w:type="dxa" w:w="3456"/>
+            <w:tcW w:type="dxa" w:w="3552"/>
             <w:vAlign w:val="top"/>
           </w:tcPr>
           <w:p>
@@ -564,7 +599,7 @@
         </w:tc>
         <w:tc>
           <w:tcPr>
-            <w:tcW w:type="dxa" w:w="3456"/>
+            <w:tcW w:type="dxa" w:w="3552"/>
             <w:vAlign w:val="top"/>
           </w:tcPr>
           <w:p>
@@ -580,9 +615,12 @@
         </w:tc>
       </w:tr>
       <w:tr>
+        <w:trPr>
+          <w:cantSplit/>
+        </w:trPr>
         <w:tc>
           <w:tcPr>
-            <w:tcW w:type="dxa" w:w="3456"/>
+            <w:tcW w:type="dxa" w:w="3552"/>
             <w:vAlign w:val="top"/>
           </w:tcPr>
           <w:p>
@@ -598,7 +636,7 @@
         </w:tc>
         <w:tc>
           <w:tcPr>
-            <w:tcW w:type="dxa" w:w="3456"/>
+            <w:tcW w:type="dxa" w:w="3552"/>
             <w:vAlign w:val="top"/>
           </w:tcPr>
           <w:p>
@@ -614,7 +652,7 @@
         </w:tc>
         <w:tc>
           <w:tcPr>
-            <w:tcW w:type="dxa" w:w="3456"/>
+            <w:tcW w:type="dxa" w:w="3552"/>
             <w:vAlign w:val="top"/>
           </w:tcPr>
           <w:p>
@@ -630,12 +668,18 @@
         </w:tc>
       </w:tr>
       <w:tr>
+        <w:trPr>
+          <w:cantSplit/>
+        </w:trPr>
         <w:tc>
           <w:tcPr>
-            <w:tcW w:type="dxa" w:w="3456"/>
+            <w:tcW w:type="dxa" w:w="3552"/>
             <w:vAlign w:val="top"/>
           </w:tcPr>
           <w:p>
+            <w:pPr>
+              <w:keepNext/>
+            </w:pPr>
             <w:r/>
             <w:r>
               <w:rPr>
@@ -648,10 +692,13 @@
         </w:tc>
         <w:tc>
           <w:tcPr>
-            <w:tcW w:type="dxa" w:w="3456"/>
+            <w:tcW w:type="dxa" w:w="3552"/>
             <w:vAlign w:val="top"/>
           </w:tcPr>
           <w:p>
+            <w:pPr>
+              <w:keepNext/>
+            </w:pPr>
             <w:r/>
             <w:r>
               <w:rPr>
@@ -664,10 +711,13 @@
         </w:tc>
         <w:tc>
           <w:tcPr>
-            <w:tcW w:type="dxa" w:w="3456"/>
+            <w:tcW w:type="dxa" w:w="3552"/>
             <w:vAlign w:val="top"/>
           </w:tcPr>
           <w:p>
+            <w:pPr>
+              <w:keepNext/>
+            </w:pPr>
             <w:r/>
             <w:r>
               <w:rPr>
@@ -680,9 +730,12 @@
         </w:tc>
       </w:tr>
       <w:tr>
+        <w:trPr>
+          <w:cantSplit/>
+        </w:trPr>
         <w:tc>
           <w:tcPr>
-            <w:tcW w:type="dxa" w:w="3456"/>
+            <w:tcW w:type="dxa" w:w="3552"/>
             <w:vAlign w:val="top"/>
           </w:tcPr>
           <w:p>
@@ -698,7 +751,7 @@
         </w:tc>
         <w:tc>
           <w:tcPr>
-            <w:tcW w:type="dxa" w:w="3456"/>
+            <w:tcW w:type="dxa" w:w="3552"/>
             <w:vAlign w:val="top"/>
           </w:tcPr>
           <w:p>
@@ -714,7 +767,7 @@
         </w:tc>
         <w:tc>
           <w:tcPr>
-            <w:tcW w:type="dxa" w:w="3456"/>
+            <w:tcW w:type="dxa" w:w="3552"/>
             <w:vAlign w:val="top"/>
           </w:tcPr>
           <w:p>
@@ -752,18 +805,19 @@
         <w:tblLook w:firstColumn="1" w:firstRow="1" w:lastColumn="0" w:lastRow="0" w:noHBand="0" w:noVBand="1" w:val="04A0"/>
       </w:tblPr>
       <w:tblGrid>
-        <w:gridCol w:w="2592"/>
-        <w:gridCol w:w="2592"/>
-        <w:gridCol w:w="2592"/>
-        <w:gridCol w:w="2592"/>
+        <w:gridCol w:w="2664"/>
+        <w:gridCol w:w="2664"/>
+        <w:gridCol w:w="2664"/>
+        <w:gridCol w:w="2664"/>
       </w:tblGrid>
       <w:tr>
         <w:trPr>
           <w:tblHeader w:val="true"/>
+          <w:cantSplit/>
         </w:trPr>
         <w:tc>
           <w:tcPr>
-            <w:tcW w:type="dxa" w:w="2592"/>
+            <w:tcW w:type="dxa" w:w="2664"/>
             <w:vAlign w:val="top"/>
             <w:shd w:fill="D9EAF7"/>
           </w:tcPr>
@@ -780,7 +834,7 @@
         </w:tc>
         <w:tc>
           <w:tcPr>
-            <w:tcW w:type="dxa" w:w="2592"/>
+            <w:tcW w:type="dxa" w:w="2664"/>
             <w:vAlign w:val="top"/>
             <w:shd w:fill="D9EAF7"/>
           </w:tcPr>
@@ -797,7 +851,7 @@
         </w:tc>
         <w:tc>
           <w:tcPr>
-            <w:tcW w:type="dxa" w:w="2592"/>
+            <w:tcW w:type="dxa" w:w="2664"/>
             <w:vAlign w:val="top"/>
             <w:shd w:fill="D9EAF7"/>
           </w:tcPr>
@@ -814,7 +868,7 @@
         </w:tc>
         <w:tc>
           <w:tcPr>
-            <w:tcW w:type="dxa" w:w="2592"/>
+            <w:tcW w:type="dxa" w:w="2664"/>
             <w:vAlign w:val="top"/>
             <w:shd w:fill="D9EAF7"/>
           </w:tcPr>
@@ -831,9 +885,12 @@
         </w:tc>
       </w:tr>
       <w:tr>
+        <w:trPr>
+          <w:cantSplit/>
+        </w:trPr>
         <w:tc>
           <w:tcPr>
-            <w:tcW w:type="dxa" w:w="2592"/>
+            <w:tcW w:type="dxa" w:w="2664"/>
             <w:vAlign w:val="top"/>
           </w:tcPr>
           <w:p>
@@ -849,7 +906,7 @@
         </w:tc>
         <w:tc>
           <w:tcPr>
-            <w:tcW w:type="dxa" w:w="2592"/>
+            <w:tcW w:type="dxa" w:w="2664"/>
             <w:vAlign w:val="top"/>
           </w:tcPr>
           <w:p>
@@ -865,7 +922,7 @@
         </w:tc>
         <w:tc>
           <w:tcPr>
-            <w:tcW w:type="dxa" w:w="2592"/>
+            <w:tcW w:type="dxa" w:w="2664"/>
             <w:vAlign w:val="top"/>
           </w:tcPr>
           <w:p>
@@ -881,7 +938,7 @@
         </w:tc>
         <w:tc>
           <w:tcPr>
-            <w:tcW w:type="dxa" w:w="2592"/>
+            <w:tcW w:type="dxa" w:w="2664"/>
             <w:vAlign w:val="top"/>
           </w:tcPr>
           <w:p>
@@ -897,9 +954,12 @@
         </w:tc>
       </w:tr>
       <w:tr>
+        <w:trPr>
+          <w:cantSplit/>
+        </w:trPr>
         <w:tc>
           <w:tcPr>
-            <w:tcW w:type="dxa" w:w="2592"/>
+            <w:tcW w:type="dxa" w:w="2664"/>
             <w:vAlign w:val="top"/>
           </w:tcPr>
           <w:p>
@@ -915,7 +975,7 @@
         </w:tc>
         <w:tc>
           <w:tcPr>
-            <w:tcW w:type="dxa" w:w="2592"/>
+            <w:tcW w:type="dxa" w:w="2664"/>
             <w:vAlign w:val="top"/>
           </w:tcPr>
           <w:p>
@@ -931,7 +991,7 @@
         </w:tc>
         <w:tc>
           <w:tcPr>
-            <w:tcW w:type="dxa" w:w="2592"/>
+            <w:tcW w:type="dxa" w:w="2664"/>
             <w:vAlign w:val="top"/>
           </w:tcPr>
           <w:p>
@@ -947,7 +1007,7 @@
         </w:tc>
         <w:tc>
           <w:tcPr>
-            <w:tcW w:type="dxa" w:w="2592"/>
+            <w:tcW w:type="dxa" w:w="2664"/>
             <w:vAlign w:val="top"/>
           </w:tcPr>
           <w:p>
@@ -963,9 +1023,12 @@
         </w:tc>
       </w:tr>
       <w:tr>
+        <w:trPr>
+          <w:cantSplit/>
+        </w:trPr>
         <w:tc>
           <w:tcPr>
-            <w:tcW w:type="dxa" w:w="2592"/>
+            <w:tcW w:type="dxa" w:w="2664"/>
             <w:vAlign w:val="top"/>
           </w:tcPr>
           <w:p>
@@ -981,7 +1044,7 @@
         </w:tc>
         <w:tc>
           <w:tcPr>
-            <w:tcW w:type="dxa" w:w="2592"/>
+            <w:tcW w:type="dxa" w:w="2664"/>
             <w:vAlign w:val="top"/>
           </w:tcPr>
           <w:p>
@@ -997,7 +1060,7 @@
         </w:tc>
         <w:tc>
           <w:tcPr>
-            <w:tcW w:type="dxa" w:w="2592"/>
+            <w:tcW w:type="dxa" w:w="2664"/>
             <w:vAlign w:val="top"/>
           </w:tcPr>
           <w:p>
@@ -1013,7 +1076,7 @@
         </w:tc>
         <w:tc>
           <w:tcPr>
-            <w:tcW w:type="dxa" w:w="2592"/>
+            <w:tcW w:type="dxa" w:w="2664"/>
             <w:vAlign w:val="top"/>
           </w:tcPr>
           <w:p>
@@ -1029,9 +1092,12 @@
         </w:tc>
       </w:tr>
       <w:tr>
+        <w:trPr>
+          <w:cantSplit/>
+        </w:trPr>
         <w:tc>
           <w:tcPr>
-            <w:tcW w:type="dxa" w:w="2592"/>
+            <w:tcW w:type="dxa" w:w="2664"/>
             <w:vAlign w:val="top"/>
           </w:tcPr>
           <w:p>
@@ -1047,7 +1113,7 @@
         </w:tc>
         <w:tc>
           <w:tcPr>
-            <w:tcW w:type="dxa" w:w="2592"/>
+            <w:tcW w:type="dxa" w:w="2664"/>
             <w:vAlign w:val="top"/>
           </w:tcPr>
           <w:p>
@@ -1063,7 +1129,7 @@
         </w:tc>
         <w:tc>
           <w:tcPr>
-            <w:tcW w:type="dxa" w:w="2592"/>
+            <w:tcW w:type="dxa" w:w="2664"/>
             <w:vAlign w:val="top"/>
           </w:tcPr>
           <w:p>
@@ -1079,7 +1145,7 @@
         </w:tc>
         <w:tc>
           <w:tcPr>
-            <w:tcW w:type="dxa" w:w="2592"/>
+            <w:tcW w:type="dxa" w:w="2664"/>
             <w:vAlign w:val="top"/>
           </w:tcPr>
           <w:p>
@@ -1095,9 +1161,540 @@
         </w:tc>
       </w:tr>
       <w:tr>
+        <w:trPr>
+          <w:cantSplit/>
+        </w:trPr>
         <w:tc>
           <w:tcPr>
-            <w:tcW w:type="dxa" w:w="2592"/>
+            <w:tcW w:type="dxa" w:w="2664"/>
+            <w:vAlign w:val="top"/>
+          </w:tcPr>
+          <w:p>
+            <w:pPr>
+              <w:keepNext/>
+            </w:pPr>
+            <w:r/>
+            <w:r>
+              <w:rPr>
+                <w:b w:val="0"/>
+                <w:sz w:val="17"/>
+              </w:rPr>
+              <w:t>Carbon intensity/emissions</w:t>
+            </w:r>
+          </w:p>
+        </w:tc>
+        <w:tc>
+          <w:tcPr>
+            <w:tcW w:type="dxa" w:w="2664"/>
+            <w:vAlign w:val="top"/>
+          </w:tcPr>
+          <w:p>
+            <w:pPr>
+              <w:keepNext/>
+            </w:pPr>
+            <w:r/>
+            <w:r>
+              <w:rPr>
+                <w:b w:val="0"/>
+                <w:sz w:val="17"/>
+              </w:rPr>
+              <w:t>Energy multiplied by active carbon factor, with default factor fallback</w:t>
+            </w:r>
+          </w:p>
+        </w:tc>
+        <w:tc>
+          <w:tcPr>
+            <w:tcW w:type="dxa" w:w="2664"/>
+            <w:vAlign w:val="top"/>
+          </w:tcPr>
+          <w:p>
+            <w:pPr>
+              <w:keepNext/>
+            </w:pPr>
+            <w:r/>
+            <w:r>
+              <w:rPr>
+                <w:b w:val="0"/>
+                <w:sz w:val="17"/>
+              </w:rPr>
+              <w:t>calculate_carbon_intensity() queries carbon_factors</w:t>
+            </w:r>
+          </w:p>
+        </w:tc>
+        <w:tc>
+          <w:tcPr>
+            <w:tcW w:type="dxa" w:w="2664"/>
+            <w:vAlign w:val="top"/>
+          </w:tcPr>
+          <w:p>
+            <w:pPr>
+              <w:keepNext/>
+            </w:pPr>
+            <w:r/>
+            <w:r>
+              <w:rPr>
+                <w:b w:val="0"/>
+                <w:sz w:val="17"/>
+              </w:rPr>
+              <w:t>database/init/04-functions.sql; /api/v1/kpi/carbon</w:t>
+            </w:r>
+          </w:p>
+        </w:tc>
+      </w:tr>
+      <w:tr>
+        <w:trPr>
+          <w:cantSplit/>
+        </w:trPr>
+        <w:tc>
+          <w:tcPr>
+            <w:tcW w:type="dxa" w:w="2664"/>
+            <w:vAlign w:val="top"/>
+          </w:tcPr>
+          <w:p>
+            <w:r/>
+            <w:r>
+              <w:rPr>
+                <w:b w:val="0"/>
+                <w:sz w:val="17"/>
+              </w:rPr>
+              <w:t>Combined KPI response</w:t>
+            </w:r>
+          </w:p>
+        </w:tc>
+        <w:tc>
+          <w:tcPr>
+            <w:tcW w:type="dxa" w:w="2664"/>
+            <w:vAlign w:val="top"/>
+          </w:tcPr>
+          <w:p>
+            <w:r/>
+            <w:r>
+              <w:rPr>
+                <w:b w:val="0"/>
+                <w:sz w:val="17"/>
+              </w:rPr>
+              <w:t>Aggregates SEC, peak demand, load factor, cost, and carbon</w:t>
+            </w:r>
+          </w:p>
+        </w:tc>
+        <w:tc>
+          <w:tcPr>
+            <w:tcW w:type="dxa" w:w="2664"/>
+            <w:vAlign w:val="top"/>
+          </w:tcPr>
+          <w:p>
+            <w:r/>
+            <w:r>
+              <w:rPr>
+                <w:b w:val="0"/>
+                <w:sz w:val="17"/>
+              </w:rPr>
+              <w:t>calculate_all_kpis() and KPIService.calculate_all_kpis()</w:t>
+            </w:r>
+          </w:p>
+        </w:tc>
+        <w:tc>
+          <w:tcPr>
+            <w:tcW w:type="dxa" w:w="2664"/>
+            <w:vAlign w:val="top"/>
+          </w:tcPr>
+          <w:p>
+            <w:r/>
+            <w:r>
+              <w:rPr>
+                <w:b w:val="0"/>
+                <w:sz w:val="17"/>
+              </w:rPr>
+              <w:t>database/init/04-functions.sql; analytics/services/kpi_service.py</w:t>
+            </w:r>
+          </w:p>
+        </w:tc>
+      </w:tr>
+    </w:tbl>
+    <w:p/>
+    <w:p>
+      <w:pPr>
+        <w:pStyle w:val="Heading1"/>
+      </w:pPr>
+      <w:r>
+        <w:t>KPI Catalog And Classification</w:t>
+      </w:r>
+    </w:p>
+    <w:p>
+      <w:r>
+        <w:t>This catalog distinguishes implemented KPI formulas from configured dashboard/reporting views and route-level estimates. It is intentionally conservative so stakeholder readers can see which measures are calculation-backed and which require review before formal use.</w:t>
+      </w:r>
+    </w:p>
+    <w:tbl>
+      <w:tblPr>
+        <w:tblStyle w:val="TableGrid"/>
+        <w:tblW w:type="auto" w:w="0"/>
+        <w:jc w:val="center"/>
+        <w:tblLook w:firstColumn="1" w:firstRow="1" w:lastColumn="0" w:lastRow="0" w:noHBand="0" w:noVBand="1" w:val="04A0"/>
+      </w:tblPr>
+      <w:tblGrid>
+        <w:gridCol w:w="2664"/>
+        <w:gridCol w:w="2664"/>
+        <w:gridCol w:w="2664"/>
+        <w:gridCol w:w="2664"/>
+      </w:tblGrid>
+      <w:tr>
+        <w:trPr>
+          <w:tblHeader w:val="true"/>
+          <w:cantSplit/>
+        </w:trPr>
+        <w:tc>
+          <w:tcPr>
+            <w:tcW w:type="dxa" w:w="2664"/>
+            <w:vAlign w:val="top"/>
+            <w:shd w:fill="D9EAF7"/>
+          </w:tcPr>
+          <w:p>
+            <w:r/>
+            <w:r>
+              <w:rPr>
+                <w:b/>
+                <w:sz w:val="17"/>
+              </w:rPr>
+              <w:t>KPI/reporting item</w:t>
+            </w:r>
+          </w:p>
+        </w:tc>
+        <w:tc>
+          <w:tcPr>
+            <w:tcW w:type="dxa" w:w="2664"/>
+            <w:vAlign w:val="top"/>
+            <w:shd w:fill="D9EAF7"/>
+          </w:tcPr>
+          <w:p>
+            <w:r/>
+            <w:r>
+              <w:rPr>
+                <w:b/>
+                <w:sz w:val="17"/>
+              </w:rPr>
+              <w:t>Classification</w:t>
+            </w:r>
+          </w:p>
+        </w:tc>
+        <w:tc>
+          <w:tcPr>
+            <w:tcW w:type="dxa" w:w="2664"/>
+            <w:vAlign w:val="top"/>
+            <w:shd w:fill="D9EAF7"/>
+          </w:tcPr>
+          <w:p>
+            <w:r/>
+            <w:r>
+              <w:rPr>
+                <w:b/>
+                <w:sz w:val="17"/>
+              </w:rPr>
+              <w:t>Implementation basis</w:t>
+            </w:r>
+          </w:p>
+        </w:tc>
+        <w:tc>
+          <w:tcPr>
+            <w:tcW w:type="dxa" w:w="2664"/>
+            <w:vAlign w:val="top"/>
+            <w:shd w:fill="D9EAF7"/>
+          </w:tcPr>
+          <w:p>
+            <w:r/>
+            <w:r>
+              <w:rPr>
+                <w:b/>
+                <w:sz w:val="17"/>
+              </w:rPr>
+              <w:t>Caution</w:t>
+            </w:r>
+          </w:p>
+        </w:tc>
+      </w:tr>
+      <w:tr>
+        <w:trPr>
+          <w:cantSplit/>
+        </w:trPr>
+        <w:tc>
+          <w:tcPr>
+            <w:tcW w:type="dxa" w:w="2664"/>
+            <w:vAlign w:val="top"/>
+          </w:tcPr>
+          <w:p>
+            <w:r/>
+            <w:r>
+              <w:rPr>
+                <w:b w:val="0"/>
+                <w:sz w:val="17"/>
+              </w:rPr>
+              <w:t>SEC</w:t>
+            </w:r>
+          </w:p>
+        </w:tc>
+        <w:tc>
+          <w:tcPr>
+            <w:tcW w:type="dxa" w:w="2664"/>
+            <w:vAlign w:val="top"/>
+          </w:tcPr>
+          <w:p>
+            <w:r/>
+            <w:r>
+              <w:rPr>
+                <w:b w:val="0"/>
+                <w:sz w:val="17"/>
+              </w:rPr>
+              <w:t>Supported by implementation</w:t>
+            </w:r>
+          </w:p>
+        </w:tc>
+        <w:tc>
+          <w:tcPr>
+            <w:tcW w:type="dxa" w:w="2664"/>
+            <w:vAlign w:val="top"/>
+          </w:tcPr>
+          <w:p>
+            <w:r/>
+            <w:r>
+              <w:rPr>
+                <w:b w:val="0"/>
+                <w:sz w:val="17"/>
+              </w:rPr>
+              <w:t>calculate_sec SQL function and /api/v1/kpi/sec route</w:t>
+            </w:r>
+          </w:p>
+        </w:tc>
+        <w:tc>
+          <w:tcPr>
+            <w:tcW w:type="dxa" w:w="2664"/>
+            <w:vAlign w:val="top"/>
+          </w:tcPr>
+          <w:p>
+            <w:r/>
+            <w:r>
+              <w:rPr>
+                <w:b w:val="0"/>
+                <w:sz w:val="17"/>
+              </w:rPr>
+              <w:t>Requires energy and production aggregate data for the selected period.</w:t>
+            </w:r>
+          </w:p>
+        </w:tc>
+      </w:tr>
+      <w:tr>
+        <w:trPr>
+          <w:cantSplit/>
+        </w:trPr>
+        <w:tc>
+          <w:tcPr>
+            <w:tcW w:type="dxa" w:w="2664"/>
+            <w:vAlign w:val="top"/>
+          </w:tcPr>
+          <w:p>
+            <w:r/>
+            <w:r>
+              <w:rPr>
+                <w:b w:val="0"/>
+                <w:sz w:val="17"/>
+              </w:rPr>
+              <w:t>Peak demand</w:t>
+            </w:r>
+          </w:p>
+        </w:tc>
+        <w:tc>
+          <w:tcPr>
+            <w:tcW w:type="dxa" w:w="2664"/>
+            <w:vAlign w:val="top"/>
+          </w:tcPr>
+          <w:p>
+            <w:r/>
+            <w:r>
+              <w:rPr>
+                <w:b w:val="0"/>
+                <w:sz w:val="17"/>
+              </w:rPr>
+              <w:t>Supported by implementation</w:t>
+            </w:r>
+          </w:p>
+        </w:tc>
+        <w:tc>
+          <w:tcPr>
+            <w:tcW w:type="dxa" w:w="2664"/>
+            <w:vAlign w:val="top"/>
+          </w:tcPr>
+          <w:p>
+            <w:r/>
+            <w:r>
+              <w:rPr>
+                <w:b w:val="0"/>
+                <w:sz w:val="17"/>
+              </w:rPr>
+              <w:t>calculate_peak_demand SQL function and route</w:t>
+            </w:r>
+          </w:p>
+        </w:tc>
+        <w:tc>
+          <w:tcPr>
+            <w:tcW w:type="dxa" w:w="2664"/>
+            <w:vAlign w:val="top"/>
+          </w:tcPr>
+          <w:p>
+            <w:r/>
+            <w:r>
+              <w:rPr>
+                <w:b w:val="0"/>
+                <w:sz w:val="17"/>
+              </w:rPr>
+              <w:t>Uses 15-minute aggregate peak_demand_kw.</w:t>
+            </w:r>
+          </w:p>
+        </w:tc>
+      </w:tr>
+      <w:tr>
+        <w:trPr>
+          <w:cantSplit/>
+        </w:trPr>
+        <w:tc>
+          <w:tcPr>
+            <w:tcW w:type="dxa" w:w="2664"/>
+            <w:vAlign w:val="top"/>
+          </w:tcPr>
+          <w:p>
+            <w:r/>
+            <w:r>
+              <w:rPr>
+                <w:b w:val="0"/>
+                <w:sz w:val="17"/>
+              </w:rPr>
+              <w:t>Load factor</w:t>
+            </w:r>
+          </w:p>
+        </w:tc>
+        <w:tc>
+          <w:tcPr>
+            <w:tcW w:type="dxa" w:w="2664"/>
+            <w:vAlign w:val="top"/>
+          </w:tcPr>
+          <w:p>
+            <w:r/>
+            <w:r>
+              <w:rPr>
+                <w:b w:val="0"/>
+                <w:sz w:val="17"/>
+              </w:rPr>
+              <w:t>Supported by implementation</w:t>
+            </w:r>
+          </w:p>
+        </w:tc>
+        <w:tc>
+          <w:tcPr>
+            <w:tcW w:type="dxa" w:w="2664"/>
+            <w:vAlign w:val="top"/>
+          </w:tcPr>
+          <w:p>
+            <w:r/>
+            <w:r>
+              <w:rPr>
+                <w:b w:val="0"/>
+                <w:sz w:val="17"/>
+              </w:rPr>
+              <w:t>calculate_load_factor SQL function and route</w:t>
+            </w:r>
+          </w:p>
+        </w:tc>
+        <w:tc>
+          <w:tcPr>
+            <w:tcW w:type="dxa" w:w="2664"/>
+            <w:vAlign w:val="top"/>
+          </w:tcPr>
+          <w:p>
+            <w:r/>
+            <w:r>
+              <w:rPr>
+                <w:b w:val="0"/>
+                <w:sz w:val="17"/>
+              </w:rPr>
+              <w:t>Depends on average/max power availability.</w:t>
+            </w:r>
+          </w:p>
+        </w:tc>
+      </w:tr>
+      <w:tr>
+        <w:trPr>
+          <w:cantSplit/>
+        </w:trPr>
+        <w:tc>
+          <w:tcPr>
+            <w:tcW w:type="dxa" w:w="2664"/>
+            <w:vAlign w:val="top"/>
+          </w:tcPr>
+          <w:p>
+            <w:r/>
+            <w:r>
+              <w:rPr>
+                <w:b w:val="0"/>
+                <w:sz w:val="17"/>
+              </w:rPr>
+              <w:t>Energy cost</w:t>
+            </w:r>
+          </w:p>
+        </w:tc>
+        <w:tc>
+          <w:tcPr>
+            <w:tcW w:type="dxa" w:w="2664"/>
+            <w:vAlign w:val="top"/>
+          </w:tcPr>
+          <w:p>
+            <w:r/>
+            <w:r>
+              <w:rPr>
+                <w:b w:val="0"/>
+                <w:sz w:val="17"/>
+              </w:rPr>
+              <w:t>Supported by implementation</w:t>
+            </w:r>
+          </w:p>
+        </w:tc>
+        <w:tc>
+          <w:tcPr>
+            <w:tcW w:type="dxa" w:w="2664"/>
+            <w:vAlign w:val="top"/>
+          </w:tcPr>
+          <w:p>
+            <w:r/>
+            <w:r>
+              <w:rPr>
+                <w:b w:val="0"/>
+                <w:sz w:val="17"/>
+              </w:rPr>
+              <w:t>calculate_energy_cost SQL function and service wrapper</w:t>
+            </w:r>
+          </w:p>
+        </w:tc>
+        <w:tc>
+          <w:tcPr>
+            <w:tcW w:type="dxa" w:w="2664"/>
+            <w:vAlign w:val="top"/>
+          </w:tcPr>
+          <w:p>
+            <w:r/>
+            <w:r>
+              <w:rPr>
+                <w:b w:val="0"/>
+                <w:sz w:val="17"/>
+              </w:rPr>
+              <w:t>Uses active tariff rows when present and default fallback in SQL.</w:t>
+            </w:r>
+          </w:p>
+        </w:tc>
+      </w:tr>
+      <w:tr>
+        <w:trPr>
+          <w:cantSplit/>
+        </w:trPr>
+        <w:tc>
+          <w:tcPr>
+            <w:tcW w:type="dxa" w:w="2664"/>
             <w:vAlign w:val="top"/>
           </w:tcPr>
           <w:p>
@@ -1113,7 +1710,7 @@
         </w:tc>
         <w:tc>
           <w:tcPr>
-            <w:tcW w:type="dxa" w:w="2592"/>
+            <w:tcW w:type="dxa" w:w="2664"/>
             <w:vAlign w:val="top"/>
           </w:tcPr>
           <w:p>
@@ -1123,13 +1720,13 @@
                 <w:b w:val="0"/>
                 <w:sz w:val="17"/>
               </w:rPr>
-              <w:t>Energy multiplied by active carbon factor, with default factor fallback</w:t>
+              <w:t>Supported by implementation</w:t>
             </w:r>
           </w:p>
         </w:tc>
         <w:tc>
           <w:tcPr>
-            <w:tcW w:type="dxa" w:w="2592"/>
+            <w:tcW w:type="dxa" w:w="2664"/>
             <w:vAlign w:val="top"/>
           </w:tcPr>
           <w:p>
@@ -1139,13 +1736,13 @@
                 <w:b w:val="0"/>
                 <w:sz w:val="17"/>
               </w:rPr>
-              <w:t>calculate_carbon_intensity() queries carbon_factors</w:t>
+              <w:t>calculate_carbon_intensity SQL function and carbon route</w:t>
             </w:r>
           </w:p>
         </w:tc>
         <w:tc>
           <w:tcPr>
-            <w:tcW w:type="dxa" w:w="2592"/>
+            <w:tcW w:type="dxa" w:w="2664"/>
             <w:vAlign w:val="top"/>
           </w:tcPr>
           <w:p>
@@ -1155,15 +1752,18 @@
                 <w:b w:val="0"/>
                 <w:sz w:val="17"/>
               </w:rPr>
-              <w:t>database/init/04-functions.sql; /api/v1/kpi/carbon</w:t>
+              <w:t>Uses carbon_factors with fallback factor; not independent emissions assurance.</w:t>
             </w:r>
           </w:p>
         </w:tc>
       </w:tr>
       <w:tr>
+        <w:trPr>
+          <w:cantSplit/>
+        </w:trPr>
         <w:tc>
           <w:tcPr>
-            <w:tcW w:type="dxa" w:w="2592"/>
+            <w:tcW w:type="dxa" w:w="2664"/>
             <w:vAlign w:val="top"/>
           </w:tcPr>
           <w:p>
@@ -1173,13 +1773,13 @@
                 <w:b w:val="0"/>
                 <w:sz w:val="17"/>
               </w:rPr>
-              <w:t>Combined KPI response</w:t>
+              <w:t>Factory KPI rollups</w:t>
             </w:r>
           </w:p>
         </w:tc>
         <w:tc>
           <w:tcPr>
-            <w:tcW w:type="dxa" w:w="2592"/>
+            <w:tcW w:type="dxa" w:w="2664"/>
             <w:vAlign w:val="top"/>
           </w:tcPr>
           <w:p>
@@ -1189,13 +1789,13 @@
                 <w:b w:val="0"/>
                 <w:sz w:val="17"/>
               </w:rPr>
-              <w:t>Aggregates SEC, peak demand, load factor, cost, and carbon</w:t>
+              <w:t>Implemented/configured</w:t>
             </w:r>
           </w:p>
         </w:tc>
         <w:tc>
           <w:tcPr>
-            <w:tcW w:type="dxa" w:w="2592"/>
+            <w:tcW w:type="dxa" w:w="2664"/>
             <w:vAlign w:val="top"/>
           </w:tcPr>
           <w:p>
@@ -1205,13 +1805,13 @@
                 <w:b w:val="0"/>
                 <w:sz w:val="17"/>
               </w:rPr>
-              <w:t>calculate_all_kpis() and KPIService.calculate_all_kpis()</w:t>
+              <w:t>/api/v1/kpi/factory/{factory_id} and /api/v1/kpi/factories</w:t>
             </w:r>
           </w:p>
         </w:tc>
         <w:tc>
           <w:tcPr>
-            <w:tcW w:type="dxa" w:w="2592"/>
+            <w:tcW w:type="dxa" w:w="2664"/>
             <w:vAlign w:val="top"/>
           </w:tcPr>
           <w:p>
@@ -1221,7 +1821,157 @@
                 <w:b w:val="0"/>
                 <w:sz w:val="17"/>
               </w:rPr>
-              <w:t>database/init/04-functions.sql; analytics/services/kpi_service.py</w:t>
+              <w:t>Some route-level estimates use constants or aggregate assumptions; review before audit use.</w:t>
+            </w:r>
+          </w:p>
+        </w:tc>
+      </w:tr>
+      <w:tr>
+        <w:trPr>
+          <w:cantSplit/>
+        </w:trPr>
+        <w:tc>
+          <w:tcPr>
+            <w:tcW w:type="dxa" w:w="2664"/>
+            <w:vAlign w:val="top"/>
+          </w:tcPr>
+          <w:p>
+            <w:pPr>
+              <w:keepNext/>
+            </w:pPr>
+            <w:r/>
+            <w:r>
+              <w:rPr>
+                <w:b w:val="0"/>
+                <w:sz w:val="17"/>
+              </w:rPr>
+              <w:t>Model performance KPIs</w:t>
+            </w:r>
+          </w:p>
+        </w:tc>
+        <w:tc>
+          <w:tcPr>
+            <w:tcW w:type="dxa" w:w="2664"/>
+            <w:vAlign w:val="top"/>
+          </w:tcPr>
+          <w:p>
+            <w:pPr>
+              <w:keepNext/>
+            </w:pPr>
+            <w:r/>
+            <w:r>
+              <w:rPr>
+                <w:b w:val="0"/>
+                <w:sz w:val="17"/>
+              </w:rPr>
+              <w:t>Implemented/configured</w:t>
+            </w:r>
+          </w:p>
+        </w:tc>
+        <w:tc>
+          <w:tcPr>
+            <w:tcW w:type="dxa" w:w="2664"/>
+            <w:vAlign w:val="top"/>
+          </w:tcPr>
+          <w:p>
+            <w:pPr>
+              <w:keepNext/>
+            </w:pPr>
+            <w:r/>
+            <w:r>
+              <w:rPr>
+                <w:b w:val="0"/>
+                <w:sz w:val="17"/>
+              </w:rPr>
+              <w:t>model_performance routes and dashboards</w:t>
+            </w:r>
+          </w:p>
+        </w:tc>
+        <w:tc>
+          <w:tcPr>
+            <w:tcW w:type="dxa" w:w="2664"/>
+            <w:vAlign w:val="top"/>
+          </w:tcPr>
+          <w:p>
+            <w:pPr>
+              <w:keepNext/>
+            </w:pPr>
+            <w:r/>
+            <w:r>
+              <w:rPr>
+                <w:b w:val="0"/>
+                <w:sz w:val="17"/>
+              </w:rPr>
+              <w:t>R2/RMSE/MAPE-style metrics depend on recorded model history.</w:t>
+            </w:r>
+          </w:p>
+        </w:tc>
+      </w:tr>
+      <w:tr>
+        <w:trPr>
+          <w:cantSplit/>
+        </w:trPr>
+        <w:tc>
+          <w:tcPr>
+            <w:tcW w:type="dxa" w:w="2664"/>
+            <w:vAlign w:val="top"/>
+          </w:tcPr>
+          <w:p>
+            <w:r/>
+            <w:r>
+              <w:rPr>
+                <w:b w:val="0"/>
+                <w:sz w:val="17"/>
+              </w:rPr>
+              <w:t>Operational efficiency/OEE</w:t>
+            </w:r>
+          </w:p>
+        </w:tc>
+        <w:tc>
+          <w:tcPr>
+            <w:tcW w:type="dxa" w:w="2664"/>
+            <w:vAlign w:val="top"/>
+          </w:tcPr>
+          <w:p>
+            <w:r/>
+            <w:r>
+              <w:rPr>
+                <w:b w:val="0"/>
+                <w:sz w:val="17"/>
+              </w:rPr>
+              <w:t>Configured dashboard/reporting view</w:t>
+            </w:r>
+          </w:p>
+        </w:tc>
+        <w:tc>
+          <w:tcPr>
+            <w:tcW w:type="dxa" w:w="2664"/>
+            <w:vAlign w:val="top"/>
+          </w:tcPr>
+          <w:p>
+            <w:r/>
+            <w:r>
+              <w:rPr>
+                <w:b w:val="0"/>
+                <w:sz w:val="17"/>
+              </w:rPr>
+              <w:t>Grafana operational-efficiency dashboards and production route</w:t>
+            </w:r>
+          </w:p>
+        </w:tc>
+        <w:tc>
+          <w:tcPr>
+            <w:tcW w:type="dxa" w:w="2664"/>
+            <w:vAlign w:val="top"/>
+          </w:tcPr>
+          <w:p>
+            <w:r/>
+            <w:r>
+              <w:rPr>
+                <w:b w:val="0"/>
+                <w:sz w:val="17"/>
+              </w:rPr>
+              <w:t>Dashboard SQL should be reviewed before formal operational reporting.</w:t>
             </w:r>
           </w:p>
         </w:tc>
@@ -1244,17 +1994,18 @@
         <w:tblLook w:firstColumn="1" w:firstRow="1" w:lastColumn="0" w:lastRow="0" w:noHBand="0" w:noVBand="1" w:val="04A0"/>
       </w:tblPr>
       <w:tblGrid>
-        <w:gridCol w:w="3456"/>
-        <w:gridCol w:w="3456"/>
-        <w:gridCol w:w="3456"/>
+        <w:gridCol w:w="3552"/>
+        <w:gridCol w:w="3552"/>
+        <w:gridCol w:w="3552"/>
       </w:tblGrid>
       <w:tr>
         <w:trPr>
           <w:tblHeader w:val="true"/>
+          <w:cantSplit/>
         </w:trPr>
         <w:tc>
           <w:tcPr>
-            <w:tcW w:type="dxa" w:w="3456"/>
+            <w:tcW w:type="dxa" w:w="3552"/>
             <w:vAlign w:val="top"/>
             <w:shd w:fill="D9EAF7"/>
           </w:tcPr>
@@ -1271,7 +2022,7 @@
         </w:tc>
         <w:tc>
           <w:tcPr>
-            <w:tcW w:type="dxa" w:w="3456"/>
+            <w:tcW w:type="dxa" w:w="3552"/>
             <w:vAlign w:val="top"/>
             <w:shd w:fill="D9EAF7"/>
           </w:tcPr>
@@ -1288,7 +2039,7 @@
         </w:tc>
         <w:tc>
           <w:tcPr>
-            <w:tcW w:type="dxa" w:w="3456"/>
+            <w:tcW w:type="dxa" w:w="3552"/>
             <w:vAlign w:val="top"/>
             <w:shd w:fill="D9EAF7"/>
           </w:tcPr>
@@ -1305,9 +2056,12 @@
         </w:tc>
       </w:tr>
       <w:tr>
+        <w:trPr>
+          <w:cantSplit/>
+        </w:trPr>
         <w:tc>
           <w:tcPr>
-            <w:tcW w:type="dxa" w:w="3456"/>
+            <w:tcW w:type="dxa" w:w="3552"/>
             <w:vAlign w:val="top"/>
           </w:tcPr>
           <w:p>
@@ -1323,7 +2077,7 @@
         </w:tc>
         <w:tc>
           <w:tcPr>
-            <w:tcW w:type="dxa" w:w="3456"/>
+            <w:tcW w:type="dxa" w:w="3552"/>
             <w:vAlign w:val="top"/>
           </w:tcPr>
           <w:p>
@@ -1339,7 +2093,7 @@
         </w:tc>
         <w:tc>
           <w:tcPr>
-            <w:tcW w:type="dxa" w:w="3456"/>
+            <w:tcW w:type="dxa" w:w="3552"/>
             <w:vAlign w:val="top"/>
           </w:tcPr>
           <w:p>
@@ -1355,9 +2109,12 @@
         </w:tc>
       </w:tr>
       <w:tr>
+        <w:trPr>
+          <w:cantSplit/>
+        </w:trPr>
         <w:tc>
           <w:tcPr>
-            <w:tcW w:type="dxa" w:w="3456"/>
+            <w:tcW w:type="dxa" w:w="3552"/>
             <w:vAlign w:val="top"/>
           </w:tcPr>
           <w:p>
@@ -1373,7 +2130,7 @@
         </w:tc>
         <w:tc>
           <w:tcPr>
-            <w:tcW w:type="dxa" w:w="3456"/>
+            <w:tcW w:type="dxa" w:w="3552"/>
             <w:vAlign w:val="top"/>
           </w:tcPr>
           <w:p>
@@ -1389,7 +2146,7 @@
         </w:tc>
         <w:tc>
           <w:tcPr>
-            <w:tcW w:type="dxa" w:w="3456"/>
+            <w:tcW w:type="dxa" w:w="3552"/>
             <w:vAlign w:val="top"/>
           </w:tcPr>
           <w:p>
@@ -1405,9 +2162,12 @@
         </w:tc>
       </w:tr>
       <w:tr>
+        <w:trPr>
+          <w:cantSplit/>
+        </w:trPr>
         <w:tc>
           <w:tcPr>
-            <w:tcW w:type="dxa" w:w="3456"/>
+            <w:tcW w:type="dxa" w:w="3552"/>
             <w:vAlign w:val="top"/>
           </w:tcPr>
           <w:p>
@@ -1423,7 +2183,7 @@
         </w:tc>
         <w:tc>
           <w:tcPr>
-            <w:tcW w:type="dxa" w:w="3456"/>
+            <w:tcW w:type="dxa" w:w="3552"/>
             <w:vAlign w:val="top"/>
           </w:tcPr>
           <w:p>
@@ -1439,7 +2199,7 @@
         </w:tc>
         <w:tc>
           <w:tcPr>
-            <w:tcW w:type="dxa" w:w="3456"/>
+            <w:tcW w:type="dxa" w:w="3552"/>
             <w:vAlign w:val="top"/>
           </w:tcPr>
           <w:p>
@@ -1455,9 +2215,12 @@
         </w:tc>
       </w:tr>
       <w:tr>
+        <w:trPr>
+          <w:cantSplit/>
+        </w:trPr>
         <w:tc>
           <w:tcPr>
-            <w:tcW w:type="dxa" w:w="3456"/>
+            <w:tcW w:type="dxa" w:w="3552"/>
             <w:vAlign w:val="top"/>
           </w:tcPr>
           <w:p>
@@ -1473,7 +2236,7 @@
         </w:tc>
         <w:tc>
           <w:tcPr>
-            <w:tcW w:type="dxa" w:w="3456"/>
+            <w:tcW w:type="dxa" w:w="3552"/>
             <w:vAlign w:val="top"/>
           </w:tcPr>
           <w:p>
@@ -1489,7 +2252,7 @@
         </w:tc>
         <w:tc>
           <w:tcPr>
-            <w:tcW w:type="dxa" w:w="3456"/>
+            <w:tcW w:type="dxa" w:w="3552"/>
             <w:vAlign w:val="top"/>
           </w:tcPr>
           <w:p>
@@ -1505,9 +2268,12 @@
         </w:tc>
       </w:tr>
       <w:tr>
+        <w:trPr>
+          <w:cantSplit/>
+        </w:trPr>
         <w:tc>
           <w:tcPr>
-            <w:tcW w:type="dxa" w:w="3456"/>
+            <w:tcW w:type="dxa" w:w="3552"/>
             <w:vAlign w:val="top"/>
           </w:tcPr>
           <w:p>
@@ -1523,7 +2289,7 @@
         </w:tc>
         <w:tc>
           <w:tcPr>
-            <w:tcW w:type="dxa" w:w="3456"/>
+            <w:tcW w:type="dxa" w:w="3552"/>
             <w:vAlign w:val="top"/>
           </w:tcPr>
           <w:p>
@@ -1539,7 +2305,7 @@
         </w:tc>
         <w:tc>
           <w:tcPr>
-            <w:tcW w:type="dxa" w:w="3456"/>
+            <w:tcW w:type="dxa" w:w="3552"/>
             <w:vAlign w:val="top"/>
           </w:tcPr>
           <w:p>
@@ -1555,12 +2321,18 @@
         </w:tc>
       </w:tr>
       <w:tr>
+        <w:trPr>
+          <w:cantSplit/>
+        </w:trPr>
         <w:tc>
           <w:tcPr>
-            <w:tcW w:type="dxa" w:w="3456"/>
+            <w:tcW w:type="dxa" w:w="3552"/>
             <w:vAlign w:val="top"/>
           </w:tcPr>
           <w:p>
+            <w:pPr>
+              <w:keepNext/>
+            </w:pPr>
             <w:r/>
             <w:r>
               <w:rPr>
@@ -1573,10 +2345,13 @@
         </w:tc>
         <w:tc>
           <w:tcPr>
-            <w:tcW w:type="dxa" w:w="3456"/>
+            <w:tcW w:type="dxa" w:w="3552"/>
             <w:vAlign w:val="top"/>
           </w:tcPr>
           <w:p>
+            <w:pPr>
+              <w:keepNext/>
+            </w:pPr>
             <w:r/>
             <w:r>
               <w:rPr>
@@ -1589,10 +2364,13 @@
         </w:tc>
         <w:tc>
           <w:tcPr>
-            <w:tcW w:type="dxa" w:w="3456"/>
+            <w:tcW w:type="dxa" w:w="3552"/>
             <w:vAlign w:val="top"/>
           </w:tcPr>
           <w:p>
+            <w:pPr>
+              <w:keepNext/>
+            </w:pPr>
             <w:r/>
             <w:r>
               <w:rPr>
@@ -1605,9 +2383,12 @@
         </w:tc>
       </w:tr>
       <w:tr>
+        <w:trPr>
+          <w:cantSplit/>
+        </w:trPr>
         <w:tc>
           <w:tcPr>
-            <w:tcW w:type="dxa" w:w="3456"/>
+            <w:tcW w:type="dxa" w:w="3552"/>
             <w:vAlign w:val="top"/>
           </w:tcPr>
           <w:p>
@@ -1623,7 +2404,7 @@
         </w:tc>
         <w:tc>
           <w:tcPr>
-            <w:tcW w:type="dxa" w:w="3456"/>
+            <w:tcW w:type="dxa" w:w="3552"/>
             <w:vAlign w:val="top"/>
           </w:tcPr>
           <w:p>
@@ -1639,7 +2420,7 @@
         </w:tc>
         <w:tc>
           <w:tcPr>
-            <w:tcW w:type="dxa" w:w="3456"/>
+            <w:tcW w:type="dxa" w:w="3552"/>
             <w:vAlign w:val="top"/>
           </w:tcPr>
           <w:p>
@@ -1677,16 +2458,17 @@
         <w:tblLook w:firstColumn="1" w:firstRow="1" w:lastColumn="0" w:lastRow="0" w:noHBand="0" w:noVBand="1" w:val="04A0"/>
       </w:tblPr>
       <w:tblGrid>
-        <w:gridCol w:w="5184"/>
-        <w:gridCol w:w="5184"/>
+        <w:gridCol w:w="5328"/>
+        <w:gridCol w:w="5328"/>
       </w:tblGrid>
       <w:tr>
         <w:trPr>
           <w:tblHeader w:val="true"/>
+          <w:cantSplit/>
         </w:trPr>
         <w:tc>
           <w:tcPr>
-            <w:tcW w:type="dxa" w:w="5184"/>
+            <w:tcW w:type="dxa" w:w="5328"/>
             <w:vAlign w:val="top"/>
             <w:shd w:fill="D9EAF7"/>
           </w:tcPr>
@@ -1703,7 +2485,7 @@
         </w:tc>
         <w:tc>
           <w:tcPr>
-            <w:tcW w:type="dxa" w:w="5184"/>
+            <w:tcW w:type="dxa" w:w="5328"/>
             <w:vAlign w:val="top"/>
             <w:shd w:fill="D9EAF7"/>
           </w:tcPr>
@@ -1720,9 +2502,12 @@
         </w:tc>
       </w:tr>
       <w:tr>
+        <w:trPr>
+          <w:cantSplit/>
+        </w:trPr>
         <w:tc>
           <w:tcPr>
-            <w:tcW w:type="dxa" w:w="5184"/>
+            <w:tcW w:type="dxa" w:w="5328"/>
             <w:vAlign w:val="top"/>
           </w:tcPr>
           <w:p>
@@ -1738,7 +2523,7 @@
         </w:tc>
         <w:tc>
           <w:tcPr>
-            <w:tcW w:type="dxa" w:w="5184"/>
+            <w:tcW w:type="dxa" w:w="5328"/>
             <w:vAlign w:val="top"/>
           </w:tcPr>
           <w:p>
@@ -1754,9 +2539,12 @@
         </w:tc>
       </w:tr>
       <w:tr>
+        <w:trPr>
+          <w:cantSplit/>
+        </w:trPr>
         <w:tc>
           <w:tcPr>
-            <w:tcW w:type="dxa" w:w="5184"/>
+            <w:tcW w:type="dxa" w:w="5328"/>
             <w:vAlign w:val="top"/>
           </w:tcPr>
           <w:p>
@@ -1772,7 +2560,7 @@
         </w:tc>
         <w:tc>
           <w:tcPr>
-            <w:tcW w:type="dxa" w:w="5184"/>
+            <w:tcW w:type="dxa" w:w="5328"/>
             <w:vAlign w:val="top"/>
           </w:tcPr>
           <w:p>
@@ -1788,9 +2576,12 @@
         </w:tc>
       </w:tr>
       <w:tr>
+        <w:trPr>
+          <w:cantSplit/>
+        </w:trPr>
         <w:tc>
           <w:tcPr>
-            <w:tcW w:type="dxa" w:w="5184"/>
+            <w:tcW w:type="dxa" w:w="5328"/>
             <w:vAlign w:val="top"/>
           </w:tcPr>
           <w:p>
@@ -1806,7 +2597,7 @@
         </w:tc>
         <w:tc>
           <w:tcPr>
-            <w:tcW w:type="dxa" w:w="5184"/>
+            <w:tcW w:type="dxa" w:w="5328"/>
             <w:vAlign w:val="top"/>
           </w:tcPr>
           <w:p>
@@ -1822,9 +2613,12 @@
         </w:tc>
       </w:tr>
       <w:tr>
+        <w:trPr>
+          <w:cantSplit/>
+        </w:trPr>
         <w:tc>
           <w:tcPr>
-            <w:tcW w:type="dxa" w:w="5184"/>
+            <w:tcW w:type="dxa" w:w="5328"/>
             <w:vAlign w:val="top"/>
           </w:tcPr>
           <w:p>
@@ -1840,7 +2634,7 @@
         </w:tc>
         <w:tc>
           <w:tcPr>
-            <w:tcW w:type="dxa" w:w="5184"/>
+            <w:tcW w:type="dxa" w:w="5328"/>
             <w:vAlign w:val="top"/>
           </w:tcPr>
           <w:p>
@@ -1856,9 +2650,12 @@
         </w:tc>
       </w:tr>
       <w:tr>
+        <w:trPr>
+          <w:cantSplit/>
+        </w:trPr>
         <w:tc>
           <w:tcPr>
-            <w:tcW w:type="dxa" w:w="5184"/>
+            <w:tcW w:type="dxa" w:w="5328"/>
             <w:vAlign w:val="top"/>
           </w:tcPr>
           <w:p>
@@ -1874,7 +2671,7 @@
         </w:tc>
         <w:tc>
           <w:tcPr>
-            <w:tcW w:type="dxa" w:w="5184"/>
+            <w:tcW w:type="dxa" w:w="5328"/>
             <w:vAlign w:val="top"/>
           </w:tcPr>
           <w:p>
@@ -1890,9 +2687,12 @@
         </w:tc>
       </w:tr>
       <w:tr>
+        <w:trPr>
+          <w:cantSplit/>
+        </w:trPr>
         <w:tc>
           <w:tcPr>
-            <w:tcW w:type="dxa" w:w="5184"/>
+            <w:tcW w:type="dxa" w:w="5328"/>
             <w:vAlign w:val="top"/>
           </w:tcPr>
           <w:p>
@@ -1908,7 +2708,7 @@
         </w:tc>
         <w:tc>
           <w:tcPr>
-            <w:tcW w:type="dxa" w:w="5184"/>
+            <w:tcW w:type="dxa" w:w="5328"/>
             <w:vAlign w:val="top"/>
           </w:tcPr>
           <w:p>
@@ -1924,9 +2724,12 @@
         </w:tc>
       </w:tr>
       <w:tr>
+        <w:trPr>
+          <w:cantSplit/>
+        </w:trPr>
         <w:tc>
           <w:tcPr>
-            <w:tcW w:type="dxa" w:w="5184"/>
+            <w:tcW w:type="dxa" w:w="5328"/>
             <w:vAlign w:val="top"/>
           </w:tcPr>
           <w:p>
@@ -1942,7 +2745,7 @@
         </w:tc>
         <w:tc>
           <w:tcPr>
-            <w:tcW w:type="dxa" w:w="5184"/>
+            <w:tcW w:type="dxa" w:w="5328"/>
             <w:vAlign w:val="top"/>
           </w:tcPr>
           <w:p>
@@ -1958,9 +2761,12 @@
         </w:tc>
       </w:tr>
       <w:tr>
+        <w:trPr>
+          <w:cantSplit/>
+        </w:trPr>
         <w:tc>
           <w:tcPr>
-            <w:tcW w:type="dxa" w:w="5184"/>
+            <w:tcW w:type="dxa" w:w="5328"/>
             <w:vAlign w:val="top"/>
           </w:tcPr>
           <w:p>
@@ -1976,7 +2782,7 @@
         </w:tc>
         <w:tc>
           <w:tcPr>
-            <w:tcW w:type="dxa" w:w="5184"/>
+            <w:tcW w:type="dxa" w:w="5328"/>
             <w:vAlign w:val="top"/>
           </w:tcPr>
           <w:p>
@@ -1992,9 +2798,12 @@
         </w:tc>
       </w:tr>
       <w:tr>
+        <w:trPr>
+          <w:cantSplit/>
+        </w:trPr>
         <w:tc>
           <w:tcPr>
-            <w:tcW w:type="dxa" w:w="5184"/>
+            <w:tcW w:type="dxa" w:w="5328"/>
             <w:vAlign w:val="top"/>
           </w:tcPr>
           <w:p>
@@ -2010,7 +2819,7 @@
         </w:tc>
         <w:tc>
           <w:tcPr>
-            <w:tcW w:type="dxa" w:w="5184"/>
+            <w:tcW w:type="dxa" w:w="5328"/>
             <w:vAlign w:val="top"/>
           </w:tcPr>
           <w:p>
@@ -2026,12 +2835,18 @@
         </w:tc>
       </w:tr>
       <w:tr>
+        <w:trPr>
+          <w:cantSplit/>
+        </w:trPr>
         <w:tc>
           <w:tcPr>
-            <w:tcW w:type="dxa" w:w="5184"/>
+            <w:tcW w:type="dxa" w:w="5328"/>
             <w:vAlign w:val="top"/>
           </w:tcPr>
           <w:p>
+            <w:pPr>
+              <w:keepNext/>
+            </w:pPr>
             <w:r/>
             <w:r>
               <w:rPr>
@@ -2044,10 +2859,13 @@
         </w:tc>
         <w:tc>
           <w:tcPr>
-            <w:tcW w:type="dxa" w:w="5184"/>
+            <w:tcW w:type="dxa" w:w="5328"/>
             <w:vAlign w:val="top"/>
           </w:tcPr>
           <w:p>
+            <w:pPr>
+              <w:keepNext/>
+            </w:pPr>
             <w:r/>
             <w:r>
               <w:rPr>
@@ -2060,9 +2878,12 @@
         </w:tc>
       </w:tr>
       <w:tr>
+        <w:trPr>
+          <w:cantSplit/>
+        </w:trPr>
         <w:tc>
           <w:tcPr>
-            <w:tcW w:type="dxa" w:w="5184"/>
+            <w:tcW w:type="dxa" w:w="5328"/>
             <w:vAlign w:val="top"/>
           </w:tcPr>
           <w:p>
@@ -2078,7 +2899,7 @@
         </w:tc>
         <w:tc>
           <w:tcPr>
-            <w:tcW w:type="dxa" w:w="5184"/>
+            <w:tcW w:type="dxa" w:w="5328"/>
             <w:vAlign w:val="top"/>
           </w:tcPr>
           <w:p>
@@ -2100,6 +2921,24 @@
         <w:pStyle w:val="Heading1"/>
       </w:pPr>
       <w:r>
+        <w:t>Dashboard Interpretation Notes</w:t>
+      </w:r>
+    </w:p>
+    <w:p>
+      <w:r>
+        <w:t>Dashboards should be treated as operational and review views over the tracked SQL/panel configuration. They are valuable for demonstration, monitoring, and stakeholder walkthroughs, but a formal audit should trace each panel query to source tables, time filters, tariff/factor assumptions, and data freshness.</w:t>
+      </w:r>
+    </w:p>
+    <w:p>
+      <w:r>
+        <w:t>There are duplicate upper/lowercase dashboard JSON variants for several SOTA dashboards in the production tree. The documentation records the configured dashboard capability without treating duplicated JSON files as separate business capabilities.</w:t>
+      </w:r>
+    </w:p>
+    <w:p>
+      <w:pPr>
+        <w:pStyle w:val="Heading1"/>
+      </w:pPr>
+      <w:r>
         <w:t>Node-RED Ingestion Pipeline</w:t>
       </w:r>
     </w:p>
@@ -2116,17 +2955,18 @@
         <w:tblLook w:firstColumn="1" w:firstRow="1" w:lastColumn="0" w:lastRow="0" w:noHBand="0" w:noVBand="1" w:val="04A0"/>
       </w:tblPr>
       <w:tblGrid>
-        <w:gridCol w:w="3456"/>
-        <w:gridCol w:w="3456"/>
-        <w:gridCol w:w="3456"/>
+        <w:gridCol w:w="3552"/>
+        <w:gridCol w:w="3552"/>
+        <w:gridCol w:w="3552"/>
       </w:tblGrid>
       <w:tr>
         <w:trPr>
           <w:tblHeader w:val="true"/>
+          <w:cantSplit/>
         </w:trPr>
         <w:tc>
           <w:tcPr>
-            <w:tcW w:type="dxa" w:w="3456"/>
+            <w:tcW w:type="dxa" w:w="3552"/>
             <w:vAlign w:val="top"/>
             <w:shd w:fill="D9EAF7"/>
           </w:tcPr>
@@ -2143,7 +2983,7 @@
         </w:tc>
         <w:tc>
           <w:tcPr>
-            <w:tcW w:type="dxa" w:w="3456"/>
+            <w:tcW w:type="dxa" w:w="3552"/>
             <w:vAlign w:val="top"/>
             <w:shd w:fill="D9EAF7"/>
           </w:tcPr>
@@ -2160,7 +3000,7 @@
         </w:tc>
         <w:tc>
           <w:tcPr>
-            <w:tcW w:type="dxa" w:w="3456"/>
+            <w:tcW w:type="dxa" w:w="3552"/>
             <w:vAlign w:val="top"/>
             <w:shd w:fill="D9EAF7"/>
           </w:tcPr>
@@ -2177,9 +3017,12 @@
         </w:tc>
       </w:tr>
       <w:tr>
+        <w:trPr>
+          <w:cantSplit/>
+        </w:trPr>
         <w:tc>
           <w:tcPr>
-            <w:tcW w:type="dxa" w:w="3456"/>
+            <w:tcW w:type="dxa" w:w="3552"/>
             <w:vAlign w:val="top"/>
           </w:tcPr>
           <w:p>
@@ -2195,7 +3038,7 @@
         </w:tc>
         <w:tc>
           <w:tcPr>
-            <w:tcW w:type="dxa" w:w="3456"/>
+            <w:tcW w:type="dxa" w:w="3552"/>
             <w:vAlign w:val="top"/>
           </w:tcPr>
           <w:p>
@@ -2211,7 +3054,7 @@
         </w:tc>
         <w:tc>
           <w:tcPr>
-            <w:tcW w:type="dxa" w:w="3456"/>
+            <w:tcW w:type="dxa" w:w="3552"/>
             <w:vAlign w:val="top"/>
           </w:tcPr>
           <w:p>
@@ -2227,9 +3070,12 @@
         </w:tc>
       </w:tr>
       <w:tr>
+        <w:trPr>
+          <w:cantSplit/>
+        </w:trPr>
         <w:tc>
           <w:tcPr>
-            <w:tcW w:type="dxa" w:w="3456"/>
+            <w:tcW w:type="dxa" w:w="3552"/>
             <w:vAlign w:val="top"/>
           </w:tcPr>
           <w:p>
@@ -2245,7 +3091,7 @@
         </w:tc>
         <w:tc>
           <w:tcPr>
-            <w:tcW w:type="dxa" w:w="3456"/>
+            <w:tcW w:type="dxa" w:w="3552"/>
             <w:vAlign w:val="top"/>
           </w:tcPr>
           <w:p>
@@ -2261,7 +3107,7 @@
         </w:tc>
         <w:tc>
           <w:tcPr>
-            <w:tcW w:type="dxa" w:w="3456"/>
+            <w:tcW w:type="dxa" w:w="3552"/>
             <w:vAlign w:val="top"/>
           </w:tcPr>
           <w:p>
@@ -2277,9 +3123,12 @@
         </w:tc>
       </w:tr>
       <w:tr>
+        <w:trPr>
+          <w:cantSplit/>
+        </w:trPr>
         <w:tc>
           <w:tcPr>
-            <w:tcW w:type="dxa" w:w="3456"/>
+            <w:tcW w:type="dxa" w:w="3552"/>
             <w:vAlign w:val="top"/>
           </w:tcPr>
           <w:p>
@@ -2295,7 +3144,7 @@
         </w:tc>
         <w:tc>
           <w:tcPr>
-            <w:tcW w:type="dxa" w:w="3456"/>
+            <w:tcW w:type="dxa" w:w="3552"/>
             <w:vAlign w:val="top"/>
           </w:tcPr>
           <w:p>
@@ -2311,7 +3160,7 @@
         </w:tc>
         <w:tc>
           <w:tcPr>
-            <w:tcW w:type="dxa" w:w="3456"/>
+            <w:tcW w:type="dxa" w:w="3552"/>
             <w:vAlign w:val="top"/>
           </w:tcPr>
           <w:p>
@@ -2327,12 +3176,18 @@
         </w:tc>
       </w:tr>
       <w:tr>
+        <w:trPr>
+          <w:cantSplit/>
+        </w:trPr>
         <w:tc>
           <w:tcPr>
-            <w:tcW w:type="dxa" w:w="3456"/>
+            <w:tcW w:type="dxa" w:w="3552"/>
             <w:vAlign w:val="top"/>
           </w:tcPr>
           <w:p>
+            <w:pPr>
+              <w:keepNext/>
+            </w:pPr>
             <w:r/>
             <w:r>
               <w:rPr>
@@ -2345,10 +3200,13 @@
         </w:tc>
         <w:tc>
           <w:tcPr>
-            <w:tcW w:type="dxa" w:w="3456"/>
+            <w:tcW w:type="dxa" w:w="3552"/>
             <w:vAlign w:val="top"/>
           </w:tcPr>
           <w:p>
+            <w:pPr>
+              <w:keepNext/>
+            </w:pPr>
             <w:r/>
             <w:r>
               <w:rPr>
@@ -2361,10 +3219,13 @@
         </w:tc>
         <w:tc>
           <w:tcPr>
-            <w:tcW w:type="dxa" w:w="3456"/>
+            <w:tcW w:type="dxa" w:w="3552"/>
             <w:vAlign w:val="top"/>
           </w:tcPr>
           <w:p>
+            <w:pPr>
+              <w:keepNext/>
+            </w:pPr>
             <w:r/>
             <w:r>
               <w:rPr>
@@ -2377,9 +3238,12 @@
         </w:tc>
       </w:tr>
       <w:tr>
+        <w:trPr>
+          <w:cantSplit/>
+        </w:trPr>
         <w:tc>
           <w:tcPr>
-            <w:tcW w:type="dxa" w:w="3456"/>
+            <w:tcW w:type="dxa" w:w="3552"/>
             <w:vAlign w:val="top"/>
           </w:tcPr>
           <w:p>
@@ -2395,7 +3259,7 @@
         </w:tc>
         <w:tc>
           <w:tcPr>
-            <w:tcW w:type="dxa" w:w="3456"/>
+            <w:tcW w:type="dxa" w:w="3552"/>
             <w:vAlign w:val="top"/>
           </w:tcPr>
           <w:p>
@@ -2411,7 +3275,7 @@
         </w:tc>
         <w:tc>
           <w:tcPr>
-            <w:tcW w:type="dxa" w:w="3456"/>
+            <w:tcW w:type="dxa" w:w="3552"/>
             <w:vAlign w:val="top"/>
           </w:tcPr>
           <w:p>
@@ -2454,17 +3318,18 @@
         <w:tblLook w:firstColumn="1" w:firstRow="1" w:lastColumn="0" w:lastRow="0" w:noHBand="0" w:noVBand="1" w:val="04A0"/>
       </w:tblPr>
       <w:tblGrid>
-        <w:gridCol w:w="3456"/>
-        <w:gridCol w:w="3456"/>
-        <w:gridCol w:w="3456"/>
+        <w:gridCol w:w="3552"/>
+        <w:gridCol w:w="3552"/>
+        <w:gridCol w:w="3552"/>
       </w:tblGrid>
       <w:tr>
         <w:trPr>
           <w:tblHeader w:val="true"/>
+          <w:cantSplit/>
         </w:trPr>
         <w:tc>
           <w:tcPr>
-            <w:tcW w:type="dxa" w:w="3456"/>
+            <w:tcW w:type="dxa" w:w="3552"/>
             <w:vAlign w:val="top"/>
             <w:shd w:fill="D9EAF7"/>
           </w:tcPr>
@@ -2481,7 +3346,7 @@
         </w:tc>
         <w:tc>
           <w:tcPr>
-            <w:tcW w:type="dxa" w:w="3456"/>
+            <w:tcW w:type="dxa" w:w="3552"/>
             <w:vAlign w:val="top"/>
             <w:shd w:fill="D9EAF7"/>
           </w:tcPr>
@@ -2498,7 +3363,7 @@
         </w:tc>
         <w:tc>
           <w:tcPr>
-            <w:tcW w:type="dxa" w:w="3456"/>
+            <w:tcW w:type="dxa" w:w="3552"/>
             <w:vAlign w:val="top"/>
             <w:shd w:fill="D9EAF7"/>
           </w:tcPr>
@@ -2515,9 +3380,12 @@
         </w:tc>
       </w:tr>
       <w:tr>
+        <w:trPr>
+          <w:cantSplit/>
+        </w:trPr>
         <w:tc>
           <w:tcPr>
-            <w:tcW w:type="dxa" w:w="3456"/>
+            <w:tcW w:type="dxa" w:w="3552"/>
             <w:vAlign w:val="top"/>
           </w:tcPr>
           <w:p>
@@ -2533,7 +3401,7 @@
         </w:tc>
         <w:tc>
           <w:tcPr>
-            <w:tcW w:type="dxa" w:w="3456"/>
+            <w:tcW w:type="dxa" w:w="3552"/>
             <w:vAlign w:val="top"/>
           </w:tcPr>
           <w:p>
@@ -2549,7 +3417,7 @@
         </w:tc>
         <w:tc>
           <w:tcPr>
-            <w:tcW w:type="dxa" w:w="3456"/>
+            <w:tcW w:type="dxa" w:w="3552"/>
             <w:vAlign w:val="top"/>
           </w:tcPr>
           <w:p>
@@ -2565,12 +3433,18 @@
         </w:tc>
       </w:tr>
       <w:tr>
+        <w:trPr>
+          <w:cantSplit/>
+        </w:trPr>
         <w:tc>
           <w:tcPr>
-            <w:tcW w:type="dxa" w:w="3456"/>
+            <w:tcW w:type="dxa" w:w="3552"/>
             <w:vAlign w:val="top"/>
           </w:tcPr>
           <w:p>
+            <w:pPr>
+              <w:keepNext/>
+            </w:pPr>
             <w:r/>
             <w:r>
               <w:rPr>
@@ -2583,10 +3457,13 @@
         </w:tc>
         <w:tc>
           <w:tcPr>
-            <w:tcW w:type="dxa" w:w="3456"/>
+            <w:tcW w:type="dxa" w:w="3552"/>
             <w:vAlign w:val="top"/>
           </w:tcPr>
           <w:p>
+            <w:pPr>
+              <w:keepNext/>
+            </w:pPr>
             <w:r/>
             <w:r>
               <w:rPr>
@@ -2599,10 +3476,13 @@
         </w:tc>
         <w:tc>
           <w:tcPr>
-            <w:tcW w:type="dxa" w:w="3456"/>
+            <w:tcW w:type="dxa" w:w="3552"/>
             <w:vAlign w:val="top"/>
           </w:tcPr>
           <w:p>
+            <w:pPr>
+              <w:keepNext/>
+            </w:pPr>
             <w:r/>
             <w:r>
               <w:rPr>
@@ -2615,9 +3495,12 @@
         </w:tc>
       </w:tr>
       <w:tr>
+        <w:trPr>
+          <w:cantSplit/>
+        </w:trPr>
         <w:tc>
           <w:tcPr>
-            <w:tcW w:type="dxa" w:w="3456"/>
+            <w:tcW w:type="dxa" w:w="3552"/>
             <w:vAlign w:val="top"/>
           </w:tcPr>
           <w:p>
@@ -2633,7 +3516,7 @@
         </w:tc>
         <w:tc>
           <w:tcPr>
-            <w:tcW w:type="dxa" w:w="3456"/>
+            <w:tcW w:type="dxa" w:w="3552"/>
             <w:vAlign w:val="top"/>
           </w:tcPr>
           <w:p>
@@ -2649,7 +3532,7 @@
         </w:tc>
         <w:tc>
           <w:tcPr>
-            <w:tcW w:type="dxa" w:w="3456"/>
+            <w:tcW w:type="dxa" w:w="3552"/>
             <w:vAlign w:val="top"/>
           </w:tcPr>
           <w:p>
@@ -2660,6 +3543,931 @@
                 <w:sz w:val="17"/>
               </w:rPr>
               <w:t>analytics/reports_v2/templates/</w:t>
+            </w:r>
+          </w:p>
+        </w:tc>
+      </w:tr>
+    </w:tbl>
+    <w:p/>
+    <w:p>
+      <w:pPr>
+        <w:pStyle w:val="Heading1"/>
+      </w:pPr>
+      <w:r>
+        <w:t>Report Workflow</w:t>
+      </w:r>
+    </w:p>
+    <w:p>
+      <w:r>
+        <w:t>The report workflow separates API request handling, data gathering, chart/template generation, PDF creation, and download/preview behavior. The workflow is implemented, but report semantics must still be reviewed before audit-grade distribution.</w:t>
+      </w:r>
+    </w:p>
+    <w:tbl>
+      <w:tblPr>
+        <w:tblStyle w:val="TableGrid"/>
+        <w:tblW w:type="auto" w:w="0"/>
+        <w:jc w:val="center"/>
+        <w:tblLook w:firstColumn="1" w:firstRow="1" w:lastColumn="0" w:lastRow="0" w:noHBand="0" w:noVBand="1" w:val="04A0"/>
+      </w:tblPr>
+      <w:tblGrid>
+        <w:gridCol w:w="3552"/>
+        <w:gridCol w:w="3552"/>
+        <w:gridCol w:w="3552"/>
+      </w:tblGrid>
+      <w:tr>
+        <w:trPr>
+          <w:tblHeader w:val="true"/>
+          <w:cantSplit/>
+        </w:trPr>
+        <w:tc>
+          <w:tcPr>
+            <w:tcW w:type="dxa" w:w="3552"/>
+            <w:vAlign w:val="top"/>
+            <w:shd w:fill="D9EAF7"/>
+          </w:tcPr>
+          <w:p>
+            <w:r/>
+            <w:r>
+              <w:rPr>
+                <w:b/>
+                <w:sz w:val="17"/>
+              </w:rPr>
+              <w:t>Step</w:t>
+            </w:r>
+          </w:p>
+        </w:tc>
+        <w:tc>
+          <w:tcPr>
+            <w:tcW w:type="dxa" w:w="3552"/>
+            <w:vAlign w:val="top"/>
+            <w:shd w:fill="D9EAF7"/>
+          </w:tcPr>
+          <w:p>
+            <w:r/>
+            <w:r>
+              <w:rPr>
+                <w:b/>
+                <w:sz w:val="17"/>
+              </w:rPr>
+              <w:t>Observed behavior</w:t>
+            </w:r>
+          </w:p>
+        </w:tc>
+        <w:tc>
+          <w:tcPr>
+            <w:tcW w:type="dxa" w:w="3552"/>
+            <w:vAlign w:val="top"/>
+            <w:shd w:fill="D9EAF7"/>
+          </w:tcPr>
+          <w:p>
+            <w:r/>
+            <w:r>
+              <w:rPr>
+                <w:b/>
+                <w:sz w:val="17"/>
+              </w:rPr>
+              <w:t>Source basis</w:t>
+            </w:r>
+          </w:p>
+        </w:tc>
+      </w:tr>
+      <w:tr>
+        <w:trPr>
+          <w:cantSplit/>
+        </w:trPr>
+        <w:tc>
+          <w:tcPr>
+            <w:tcW w:type="dxa" w:w="3552"/>
+            <w:vAlign w:val="top"/>
+          </w:tcPr>
+          <w:p>
+            <w:r/>
+            <w:r>
+              <w:rPr>
+                <w:b w:val="0"/>
+                <w:sz w:val="17"/>
+              </w:rPr>
+              <w:t>Legacy report request</w:t>
+            </w:r>
+          </w:p>
+        </w:tc>
+        <w:tc>
+          <w:tcPr>
+            <w:tcW w:type="dxa" w:w="3552"/>
+            <w:vAlign w:val="top"/>
+          </w:tcPr>
+          <w:p>
+            <w:r/>
+            <w:r>
+              <w:rPr>
+                <w:b w:val="0"/>
+                <w:sz w:val="17"/>
+              </w:rPr>
+              <w:t>Client calls /api/v1/reports/types, /preview, or /generate for monthly_enpi.</w:t>
+            </w:r>
+          </w:p>
+        </w:tc>
+        <w:tc>
+          <w:tcPr>
+            <w:tcW w:type="dxa" w:w="3552"/>
+            <w:vAlign w:val="top"/>
+          </w:tcPr>
+          <w:p>
+            <w:r/>
+            <w:r>
+              <w:rPr>
+                <w:b w:val="0"/>
+                <w:sz w:val="17"/>
+              </w:rPr>
+              <w:t>analytics/api/routes/reports.py</w:t>
+            </w:r>
+          </w:p>
+        </w:tc>
+      </w:tr>
+      <w:tr>
+        <w:trPr>
+          <w:cantSplit/>
+        </w:trPr>
+        <w:tc>
+          <w:tcPr>
+            <w:tcW w:type="dxa" w:w="3552"/>
+            <w:vAlign w:val="top"/>
+          </w:tcPr>
+          <w:p>
+            <w:r/>
+            <w:r>
+              <w:rPr>
+                <w:b w:val="0"/>
+                <w:sz w:val="17"/>
+              </w:rPr>
+              <w:t>Legacy data assembly</w:t>
+            </w:r>
+          </w:p>
+        </w:tc>
+        <w:tc>
+          <w:tcPr>
+            <w:tcW w:type="dxa" w:w="3552"/>
+            <w:vAlign w:val="top"/>
+          </w:tcPr>
+          <w:p>
+            <w:r/>
+            <w:r>
+              <w:rPr>
+                <w:b w:val="0"/>
+                <w:sz w:val="17"/>
+              </w:rPr>
+              <w:t>MonthlyEnPIReport builds summary, machine metrics, EnPI values, targets, achievements, and charts.</w:t>
+            </w:r>
+          </w:p>
+        </w:tc>
+        <w:tc>
+          <w:tcPr>
+            <w:tcW w:type="dxa" w:w="3552"/>
+            <w:vAlign w:val="top"/>
+          </w:tcPr>
+          <w:p>
+            <w:r/>
+            <w:r>
+              <w:rPr>
+                <w:b w:val="0"/>
+                <w:sz w:val="17"/>
+              </w:rPr>
+              <w:t>analytics/reports/monthly_enpi_report.py</w:t>
+            </w:r>
+          </w:p>
+        </w:tc>
+      </w:tr>
+      <w:tr>
+        <w:trPr>
+          <w:cantSplit/>
+        </w:trPr>
+        <w:tc>
+          <w:tcPr>
+            <w:tcW w:type="dxa" w:w="3552"/>
+            <w:vAlign w:val="top"/>
+          </w:tcPr>
+          <w:p>
+            <w:r/>
+            <w:r>
+              <w:rPr>
+                <w:b w:val="0"/>
+                <w:sz w:val="17"/>
+              </w:rPr>
+              <w:t>Legacy output</w:t>
+            </w:r>
+          </w:p>
+        </w:tc>
+        <w:tc>
+          <w:tcPr>
+            <w:tcW w:type="dxa" w:w="3552"/>
+            <w:vAlign w:val="top"/>
+          </w:tcPr>
+          <w:p>
+            <w:r/>
+            <w:r>
+              <w:rPr>
+                <w:b w:val="0"/>
+                <w:sz w:val="17"/>
+              </w:rPr>
+              <w:t>ReportLab PDF is returned by the route.</w:t>
+            </w:r>
+          </w:p>
+        </w:tc>
+        <w:tc>
+          <w:tcPr>
+            <w:tcW w:type="dxa" w:w="3552"/>
+            <w:vAlign w:val="top"/>
+          </w:tcPr>
+          <w:p>
+            <w:r/>
+            <w:r>
+              <w:rPr>
+                <w:b w:val="0"/>
+                <w:sz w:val="17"/>
+              </w:rPr>
+              <w:t>analytics/reports/base_report.py; analytics/api/routes/reports.py</w:t>
+            </w:r>
+          </w:p>
+        </w:tc>
+      </w:tr>
+      <w:tr>
+        <w:trPr>
+          <w:cantSplit/>
+        </w:trPr>
+        <w:tc>
+          <w:tcPr>
+            <w:tcW w:type="dxa" w:w="3552"/>
+            <w:vAlign w:val="top"/>
+          </w:tcPr>
+          <w:p>
+            <w:r/>
+            <w:r>
+              <w:rPr>
+                <w:b w:val="0"/>
+                <w:sz w:val="17"/>
+              </w:rPr>
+              <w:t>V2 report request</w:t>
+            </w:r>
+          </w:p>
+        </w:tc>
+        <w:tc>
+          <w:tcPr>
+            <w:tcW w:type="dxa" w:w="3552"/>
+            <w:vAlign w:val="top"/>
+          </w:tcPr>
+          <w:p>
+            <w:r/>
+            <w:r>
+              <w:rPr>
+                <w:b w:val="0"/>
+                <w:sz w:val="17"/>
+              </w:rPr>
+              <w:t>Client calls /api/v1/reports/v2/generate and later /v2/download/{report_id}.</w:t>
+            </w:r>
+          </w:p>
+        </w:tc>
+        <w:tc>
+          <w:tcPr>
+            <w:tcW w:type="dxa" w:w="3552"/>
+            <w:vAlign w:val="top"/>
+          </w:tcPr>
+          <w:p>
+            <w:r/>
+            <w:r>
+              <w:rPr>
+                <w:b w:val="0"/>
+                <w:sz w:val="17"/>
+              </w:rPr>
+              <w:t>analytics/api/routes/reports.py</w:t>
+            </w:r>
+          </w:p>
+        </w:tc>
+      </w:tr>
+      <w:tr>
+        <w:trPr>
+          <w:cantSplit/>
+        </w:trPr>
+        <w:tc>
+          <w:tcPr>
+            <w:tcW w:type="dxa" w:w="3552"/>
+            <w:vAlign w:val="top"/>
+          </w:tcPr>
+          <w:p>
+            <w:pPr>
+              <w:keepNext/>
+            </w:pPr>
+            <w:r/>
+            <w:r>
+              <w:rPr>
+                <w:b w:val="0"/>
+                <w:sz w:val="17"/>
+              </w:rPr>
+              <w:t>V2 generation</w:t>
+            </w:r>
+          </w:p>
+        </w:tc>
+        <w:tc>
+          <w:tcPr>
+            <w:tcW w:type="dxa" w:w="3552"/>
+            <w:vAlign w:val="top"/>
+          </w:tcPr>
+          <w:p>
+            <w:pPr>
+              <w:keepNext/>
+            </w:pPr>
+            <w:r/>
+            <w:r>
+              <w:rPr>
+                <w:b w:val="0"/>
+                <w:sz w:val="17"/>
+              </w:rPr>
+              <w:t>ReportService coordinates data fetch, components, charts, HTML/PDF generation, and temporary output path.</w:t>
+            </w:r>
+          </w:p>
+        </w:tc>
+        <w:tc>
+          <w:tcPr>
+            <w:tcW w:type="dxa" w:w="3552"/>
+            <w:vAlign w:val="top"/>
+          </w:tcPr>
+          <w:p>
+            <w:pPr>
+              <w:keepNext/>
+            </w:pPr>
+            <w:r/>
+            <w:r>
+              <w:rPr>
+                <w:b w:val="0"/>
+                <w:sz w:val="17"/>
+              </w:rPr>
+              <w:t>analytics/reports_v2/services/report_service.py</w:t>
+            </w:r>
+          </w:p>
+        </w:tc>
+      </w:tr>
+      <w:tr>
+        <w:trPr>
+          <w:cantSplit/>
+        </w:trPr>
+        <w:tc>
+          <w:tcPr>
+            <w:tcW w:type="dxa" w:w="3552"/>
+            <w:vAlign w:val="top"/>
+          </w:tcPr>
+          <w:p>
+            <w:r/>
+            <w:r>
+              <w:rPr>
+                <w:b w:val="0"/>
+                <w:sz w:val="17"/>
+              </w:rPr>
+              <w:t>V2 caution</w:t>
+            </w:r>
+          </w:p>
+        </w:tc>
+        <w:tc>
+          <w:tcPr>
+            <w:tcW w:type="dxa" w:w="3552"/>
+            <w:vAlign w:val="top"/>
+          </w:tcPr>
+          <w:p>
+            <w:r/>
+            <w:r>
+              <w:rPr>
+                <w:b w:val="0"/>
+                <w:sz w:val="17"/>
+              </w:rPr>
+              <w:t>Some data fetcher/service values are estimated or placeholder-like.</w:t>
+            </w:r>
+          </w:p>
+        </w:tc>
+        <w:tc>
+          <w:tcPr>
+            <w:tcW w:type="dxa" w:w="3552"/>
+            <w:vAlign w:val="top"/>
+          </w:tcPr>
+          <w:p>
+            <w:r/>
+            <w:r>
+              <w:rPr>
+                <w:b w:val="0"/>
+                <w:sz w:val="17"/>
+              </w:rPr>
+              <w:t>analytics/reports_v2/services/data_fetcher.py; report_service.py</w:t>
+            </w:r>
+          </w:p>
+        </w:tc>
+      </w:tr>
+    </w:tbl>
+    <w:p/>
+    <w:p>
+      <w:pPr>
+        <w:pStyle w:val="Heading1"/>
+      </w:pPr>
+      <w:r>
+        <w:t>Data-Quality Assumptions</w:t>
+      </w:r>
+    </w:p>
+    <w:p>
+      <w:r>
+        <w:t>KPI and report outputs assume data freshness, correctly associated machine/factory records, synchronized timestamps, and appropriate tariff/carbon-factor records. These assumptions are not always enforceable by the codebase alone and should be part of operational handover.</w:t>
+      </w:r>
+    </w:p>
+    <w:tbl>
+      <w:tblPr>
+        <w:tblStyle w:val="TableGrid"/>
+        <w:tblW w:type="auto" w:w="0"/>
+        <w:jc w:val="center"/>
+        <w:tblLook w:firstColumn="1" w:firstRow="1" w:lastColumn="0" w:lastRow="0" w:noHBand="0" w:noVBand="1" w:val="04A0"/>
+      </w:tblPr>
+      <w:tblGrid>
+        <w:gridCol w:w="5328"/>
+        <w:gridCol w:w="5328"/>
+      </w:tblGrid>
+      <w:tr>
+        <w:trPr>
+          <w:tblHeader w:val="true"/>
+          <w:cantSplit/>
+        </w:trPr>
+        <w:tc>
+          <w:tcPr>
+            <w:tcW w:type="dxa" w:w="5328"/>
+            <w:vAlign w:val="top"/>
+            <w:shd w:fill="D9EAF7"/>
+          </w:tcPr>
+          <w:p>
+            <w:r/>
+            <w:r>
+              <w:rPr>
+                <w:b/>
+                <w:sz w:val="17"/>
+              </w:rPr>
+              <w:t>Assumption</w:t>
+            </w:r>
+          </w:p>
+        </w:tc>
+        <w:tc>
+          <w:tcPr>
+            <w:tcW w:type="dxa" w:w="5328"/>
+            <w:vAlign w:val="top"/>
+            <w:shd w:fill="D9EAF7"/>
+          </w:tcPr>
+          <w:p>
+            <w:r/>
+            <w:r>
+              <w:rPr>
+                <w:b/>
+                <w:sz w:val="17"/>
+              </w:rPr>
+              <w:t>Reason</w:t>
+            </w:r>
+          </w:p>
+        </w:tc>
+      </w:tr>
+      <w:tr>
+        <w:trPr>
+          <w:cantSplit/>
+        </w:trPr>
+        <w:tc>
+          <w:tcPr>
+            <w:tcW w:type="dxa" w:w="5328"/>
+            <w:vAlign w:val="top"/>
+          </w:tcPr>
+          <w:p>
+            <w:r/>
+            <w:r>
+              <w:rPr>
+                <w:b w:val="0"/>
+                <w:sz w:val="17"/>
+              </w:rPr>
+              <w:t>Clock/time range</w:t>
+            </w:r>
+          </w:p>
+        </w:tc>
+        <w:tc>
+          <w:tcPr>
+            <w:tcW w:type="dxa" w:w="5328"/>
+            <w:vAlign w:val="top"/>
+          </w:tcPr>
+          <w:p>
+            <w:r/>
+            <w:r>
+              <w:rPr>
+                <w:b w:val="0"/>
+                <w:sz w:val="17"/>
+              </w:rPr>
+              <w:t>KPI, baseline, forecast, and dashboard results assume timestamps are correctly generated and synchronized.</w:t>
+            </w:r>
+          </w:p>
+        </w:tc>
+      </w:tr>
+      <w:tr>
+        <w:trPr>
+          <w:cantSplit/>
+        </w:trPr>
+        <w:tc>
+          <w:tcPr>
+            <w:tcW w:type="dxa" w:w="5328"/>
+            <w:vAlign w:val="top"/>
+          </w:tcPr>
+          <w:p>
+            <w:r/>
+            <w:r>
+              <w:rPr>
+                <w:b w:val="0"/>
+                <w:sz w:val="17"/>
+              </w:rPr>
+              <w:t>Telemetry completeness</w:t>
+            </w:r>
+          </w:p>
+        </w:tc>
+        <w:tc>
+          <w:tcPr>
+            <w:tcW w:type="dxa" w:w="5328"/>
+            <w:vAlign w:val="top"/>
+          </w:tcPr>
+          <w:p>
+            <w:r/>
+            <w:r>
+              <w:rPr>
+                <w:b w:val="0"/>
+                <w:sz w:val="17"/>
+              </w:rPr>
+              <w:t>SEC and production-linked KPIs require both energy and production data; missing production affects denominator quality.</w:t>
+            </w:r>
+          </w:p>
+        </w:tc>
+      </w:tr>
+      <w:tr>
+        <w:trPr>
+          <w:cantSplit/>
+        </w:trPr>
+        <w:tc>
+          <w:tcPr>
+            <w:tcW w:type="dxa" w:w="5328"/>
+            <w:vAlign w:val="top"/>
+          </w:tcPr>
+          <w:p>
+            <w:r/>
+            <w:r>
+              <w:rPr>
+                <w:b w:val="0"/>
+                <w:sz w:val="17"/>
+              </w:rPr>
+              <w:t>Topic consistency</w:t>
+            </w:r>
+          </w:p>
+        </w:tc>
+        <w:tc>
+          <w:tcPr>
+            <w:tcW w:type="dxa" w:w="5328"/>
+            <w:vAlign w:val="top"/>
+          </w:tcPr>
+          <w:p>
+            <w:r/>
+            <w:r>
+              <w:rPr>
+                <w:b w:val="0"/>
+                <w:sz w:val="17"/>
+              </w:rPr>
+              <w:t>Node-RED routing assumes MQTT topics match expected factory/# structure and payload type handling.</w:t>
+            </w:r>
+          </w:p>
+        </w:tc>
+      </w:tr>
+      <w:tr>
+        <w:trPr>
+          <w:cantSplit/>
+        </w:trPr>
+        <w:tc>
+          <w:tcPr>
+            <w:tcW w:type="dxa" w:w="5328"/>
+            <w:vAlign w:val="top"/>
+          </w:tcPr>
+          <w:p>
+            <w:r/>
+            <w:r>
+              <w:rPr>
+                <w:b w:val="0"/>
+                <w:sz w:val="17"/>
+              </w:rPr>
+              <w:t>Tariff/factor validity</w:t>
+            </w:r>
+          </w:p>
+        </w:tc>
+        <w:tc>
+          <w:tcPr>
+            <w:tcW w:type="dxa" w:w="5328"/>
+            <w:vAlign w:val="top"/>
+          </w:tcPr>
+          <w:p>
+            <w:r/>
+            <w:r>
+              <w:rPr>
+                <w:b w:val="0"/>
+                <w:sz w:val="17"/>
+              </w:rPr>
+              <w:t>Cost and carbon outputs depend on active tariff and carbon-factor records or configured fallback factors.</w:t>
+            </w:r>
+          </w:p>
+        </w:tc>
+      </w:tr>
+      <w:tr>
+        <w:trPr>
+          <w:cantSplit/>
+        </w:trPr>
+        <w:tc>
+          <w:tcPr>
+            <w:tcW w:type="dxa" w:w="5328"/>
+            <w:vAlign w:val="top"/>
+          </w:tcPr>
+          <w:p>
+            <w:pPr>
+              <w:keepNext/>
+            </w:pPr>
+            <w:r/>
+            <w:r>
+              <w:rPr>
+                <w:b w:val="0"/>
+                <w:sz w:val="17"/>
+              </w:rPr>
+              <w:t>Simulator vs real data</w:t>
+            </w:r>
+          </w:p>
+        </w:tc>
+        <w:tc>
+          <w:tcPr>
+            <w:tcW w:type="dxa" w:w="5328"/>
+            <w:vAlign w:val="top"/>
+          </w:tcPr>
+          <w:p>
+            <w:pPr>
+              <w:keepNext/>
+            </w:pPr>
+            <w:r/>
+            <w:r>
+              <w:rPr>
+                <w:b w:val="0"/>
+                <w:sz w:val="17"/>
+              </w:rPr>
+              <w:t>Seed/demo simulator data is suitable for demonstration but should be separated from live factory evidence.</w:t>
+            </w:r>
+          </w:p>
+        </w:tc>
+      </w:tr>
+      <w:tr>
+        <w:trPr>
+          <w:cantSplit/>
+        </w:trPr>
+        <w:tc>
+          <w:tcPr>
+            <w:tcW w:type="dxa" w:w="5328"/>
+            <w:vAlign w:val="top"/>
+          </w:tcPr>
+          <w:p>
+            <w:r/>
+            <w:r>
+              <w:rPr>
+                <w:b w:val="0"/>
+                <w:sz w:val="17"/>
+              </w:rPr>
+              <w:t>Aggregate freshness</w:t>
+            </w:r>
+          </w:p>
+        </w:tc>
+        <w:tc>
+          <w:tcPr>
+            <w:tcW w:type="dxa" w:w="5328"/>
+            <w:vAlign w:val="top"/>
+          </w:tcPr>
+          <w:p>
+            <w:r/>
+            <w:r>
+              <w:rPr>
+                <w:b w:val="0"/>
+                <w:sz w:val="17"/>
+              </w:rPr>
+              <w:t>Continuous aggregates and dashboards depend on database refresh behavior and current ingested data.</w:t>
+            </w:r>
+          </w:p>
+        </w:tc>
+      </w:tr>
+    </w:tbl>
+    <w:p/>
+    <w:p>
+      <w:pPr>
+        <w:pStyle w:val="Heading1"/>
+      </w:pPr>
+      <w:r>
+        <w:t>Audit-Use Cautions</w:t>
+      </w:r>
+    </w:p>
+    <w:p>
+      <w:r>
+        <w:t>The system implements carbon, cost, EnPI, SEC, forecasting, anomaly, and report capabilities where code/config evidence exists. That does not automatically make every generated output suitable for regulatory, financial, or audited sustainability reporting without governance review.</w:t>
+      </w:r>
+    </w:p>
+    <w:tbl>
+      <w:tblPr>
+        <w:tblStyle w:val="TableGrid"/>
+        <w:tblW w:type="auto" w:w="0"/>
+        <w:jc w:val="center"/>
+        <w:tblLook w:firstColumn="1" w:firstRow="1" w:lastColumn="0" w:lastRow="0" w:noHBand="0" w:noVBand="1" w:val="04A0"/>
+      </w:tblPr>
+      <w:tblGrid>
+        <w:gridCol w:w="5328"/>
+        <w:gridCol w:w="5328"/>
+      </w:tblGrid>
+      <w:tr>
+        <w:trPr>
+          <w:tblHeader w:val="true"/>
+          <w:cantSplit/>
+        </w:trPr>
+        <w:tc>
+          <w:tcPr>
+            <w:tcW w:type="dxa" w:w="5328"/>
+            <w:vAlign w:val="top"/>
+            <w:shd w:fill="D9EAF7"/>
+          </w:tcPr>
+          <w:p>
+            <w:r/>
+            <w:r>
+              <w:rPr>
+                <w:b/>
+                <w:sz w:val="17"/>
+              </w:rPr>
+              <w:t>Caution</w:t>
+            </w:r>
+          </w:p>
+        </w:tc>
+        <w:tc>
+          <w:tcPr>
+            <w:tcW w:type="dxa" w:w="5328"/>
+            <w:vAlign w:val="top"/>
+            <w:shd w:fill="D9EAF7"/>
+          </w:tcPr>
+          <w:p>
+            <w:r/>
+            <w:r>
+              <w:rPr>
+                <w:b/>
+                <w:sz w:val="17"/>
+              </w:rPr>
+              <w:t>Stakeholder guidance</w:t>
+            </w:r>
+          </w:p>
+        </w:tc>
+      </w:tr>
+      <w:tr>
+        <w:trPr>
+          <w:cantSplit/>
+        </w:trPr>
+        <w:tc>
+          <w:tcPr>
+            <w:tcW w:type="dxa" w:w="5328"/>
+            <w:vAlign w:val="top"/>
+          </w:tcPr>
+          <w:p>
+            <w:r/>
+            <w:r>
+              <w:rPr>
+                <w:b w:val="0"/>
+                <w:sz w:val="17"/>
+              </w:rPr>
+              <w:t>Audit-grade KPI use</w:t>
+            </w:r>
+          </w:p>
+        </w:tc>
+        <w:tc>
+          <w:tcPr>
+            <w:tcW w:type="dxa" w:w="5328"/>
+            <w:vAlign w:val="top"/>
+          </w:tcPr>
+          <w:p>
+            <w:r/>
+            <w:r>
+              <w:rPr>
+                <w:b w:val="0"/>
+                <w:sz w:val="17"/>
+              </w:rPr>
+              <w:t>Do not treat generated reports as audited energy statements without validating formulas, data sources, tariff/factor records, and reporting period boundaries.</w:t>
+            </w:r>
+          </w:p>
+        </w:tc>
+      </w:tr>
+      <w:tr>
+        <w:trPr>
+          <w:cantSplit/>
+        </w:trPr>
+        <w:tc>
+          <w:tcPr>
+            <w:tcW w:type="dxa" w:w="5328"/>
+            <w:vAlign w:val="top"/>
+          </w:tcPr>
+          <w:p>
+            <w:r/>
+            <w:r>
+              <w:rPr>
+                <w:b w:val="0"/>
+                <w:sz w:val="17"/>
+              </w:rPr>
+              <w:t>Carbon reporting</w:t>
+            </w:r>
+          </w:p>
+        </w:tc>
+        <w:tc>
+          <w:tcPr>
+            <w:tcW w:type="dxa" w:w="5328"/>
+            <w:vAlign w:val="top"/>
+          </w:tcPr>
+          <w:p>
+            <w:r/>
+            <w:r>
+              <w:rPr>
+                <w:b w:val="0"/>
+                <w:sz w:val="17"/>
+              </w:rPr>
+              <w:t>Carbon/emissions values are implemented where functions/routes/dashboards exist, but formal emissions reporting requires verified factors, scope definitions, and governance outside this codebase.</w:t>
+            </w:r>
+          </w:p>
+        </w:tc>
+      </w:tr>
+      <w:tr>
+        <w:trPr>
+          <w:cantSplit/>
+        </w:trPr>
+        <w:tc>
+          <w:tcPr>
+            <w:tcW w:type="dxa" w:w="5328"/>
+            <w:vAlign w:val="top"/>
+          </w:tcPr>
+          <w:p>
+            <w:pPr>
+              <w:keepNext/>
+            </w:pPr>
+            <w:r/>
+            <w:r>
+              <w:rPr>
+                <w:b w:val="0"/>
+                <w:sz w:val="17"/>
+              </w:rPr>
+              <w:t>Demo seed data</w:t>
+            </w:r>
+          </w:p>
+        </w:tc>
+        <w:tc>
+          <w:tcPr>
+            <w:tcW w:type="dxa" w:w="5328"/>
+            <w:vAlign w:val="top"/>
+          </w:tcPr>
+          <w:p>
+            <w:pPr>
+              <w:keepNext/>
+            </w:pPr>
+            <w:r/>
+            <w:r>
+              <w:rPr>
+                <w:b w:val="0"/>
+                <w:sz w:val="17"/>
+              </w:rPr>
+              <w:t>Seeded factories and machines should be labeled as demonstration data unless replaced by real facility data.</w:t>
+            </w:r>
+          </w:p>
+        </w:tc>
+      </w:tr>
+      <w:tr>
+        <w:trPr>
+          <w:cantSplit/>
+        </w:trPr>
+        <w:tc>
+          <w:tcPr>
+            <w:tcW w:type="dxa" w:w="5328"/>
+            <w:vAlign w:val="top"/>
+          </w:tcPr>
+          <w:p>
+            <w:r/>
+            <w:r>
+              <w:rPr>
+                <w:b w:val="0"/>
+                <w:sz w:val="17"/>
+              </w:rPr>
+              <w:t>Placeholder calculations</w:t>
+            </w:r>
+          </w:p>
+        </w:tc>
+        <w:tc>
+          <w:tcPr>
+            <w:tcW w:type="dxa" w:w="5328"/>
+            <w:vAlign w:val="top"/>
+          </w:tcPr>
+          <w:p>
+            <w:r/>
+            <w:r>
+              <w:rPr>
+                <w:b w:val="0"/>
+                <w:sz w:val="17"/>
+              </w:rPr>
+              <w:t>Where V2 reports or dashboard panels derive estimates, identify them in stakeholder review rather than presenting them as certified calculations.</w:t>
             </w:r>
           </w:p>
         </w:tc>
@@ -2682,17 +4490,18 @@
         <w:tblLook w:firstColumn="1" w:firstRow="1" w:lastColumn="0" w:lastRow="0" w:noHBand="0" w:noVBand="1" w:val="04A0"/>
       </w:tblPr>
       <w:tblGrid>
-        <w:gridCol w:w="3456"/>
-        <w:gridCol w:w="3456"/>
-        <w:gridCol w:w="3456"/>
+        <w:gridCol w:w="3552"/>
+        <w:gridCol w:w="3552"/>
+        <w:gridCol w:w="3552"/>
       </w:tblGrid>
       <w:tr>
         <w:trPr>
           <w:tblHeader w:val="true"/>
+          <w:cantSplit/>
         </w:trPr>
         <w:tc>
           <w:tcPr>
-            <w:tcW w:type="dxa" w:w="3456"/>
+            <w:tcW w:type="dxa" w:w="3552"/>
             <w:vAlign w:val="top"/>
             <w:shd w:fill="D9EAF7"/>
           </w:tcPr>
@@ -2709,7 +4518,7 @@
         </w:tc>
         <w:tc>
           <w:tcPr>
-            <w:tcW w:type="dxa" w:w="3456"/>
+            <w:tcW w:type="dxa" w:w="3552"/>
             <w:vAlign w:val="top"/>
             <w:shd w:fill="D9EAF7"/>
           </w:tcPr>
@@ -2726,7 +4535,7 @@
         </w:tc>
         <w:tc>
           <w:tcPr>
-            <w:tcW w:type="dxa" w:w="3456"/>
+            <w:tcW w:type="dxa" w:w="3552"/>
             <w:vAlign w:val="top"/>
             <w:shd w:fill="D9EAF7"/>
           </w:tcPr>
@@ -2743,9 +4552,12 @@
         </w:tc>
       </w:tr>
       <w:tr>
+        <w:trPr>
+          <w:cantSplit/>
+        </w:trPr>
         <w:tc>
           <w:tcPr>
-            <w:tcW w:type="dxa" w:w="3456"/>
+            <w:tcW w:type="dxa" w:w="3552"/>
             <w:vAlign w:val="top"/>
           </w:tcPr>
           <w:p>
@@ -2761,7 +4573,7 @@
         </w:tc>
         <w:tc>
           <w:tcPr>
-            <w:tcW w:type="dxa" w:w="3456"/>
+            <w:tcW w:type="dxa" w:w="3552"/>
             <w:vAlign w:val="top"/>
           </w:tcPr>
           <w:p>
@@ -2777,7 +4589,7 @@
         </w:tc>
         <w:tc>
           <w:tcPr>
-            <w:tcW w:type="dxa" w:w="3456"/>
+            <w:tcW w:type="dxa" w:w="3552"/>
             <w:vAlign w:val="top"/>
           </w:tcPr>
           <w:p>
@@ -2793,9 +4605,12 @@
         </w:tc>
       </w:tr>
       <w:tr>
+        <w:trPr>
+          <w:cantSplit/>
+        </w:trPr>
         <w:tc>
           <w:tcPr>
-            <w:tcW w:type="dxa" w:w="3456"/>
+            <w:tcW w:type="dxa" w:w="3552"/>
             <w:vAlign w:val="top"/>
           </w:tcPr>
           <w:p>
@@ -2811,7 +4626,7 @@
         </w:tc>
         <w:tc>
           <w:tcPr>
-            <w:tcW w:type="dxa" w:w="3456"/>
+            <w:tcW w:type="dxa" w:w="3552"/>
             <w:vAlign w:val="top"/>
           </w:tcPr>
           <w:p>
@@ -2827,7 +4642,7 @@
         </w:tc>
         <w:tc>
           <w:tcPr>
-            <w:tcW w:type="dxa" w:w="3456"/>
+            <w:tcW w:type="dxa" w:w="3552"/>
             <w:vAlign w:val="top"/>
           </w:tcPr>
           <w:p>
@@ -2843,9 +4658,12 @@
         </w:tc>
       </w:tr>
       <w:tr>
+        <w:trPr>
+          <w:cantSplit/>
+        </w:trPr>
         <w:tc>
           <w:tcPr>
-            <w:tcW w:type="dxa" w:w="3456"/>
+            <w:tcW w:type="dxa" w:w="3552"/>
             <w:vAlign w:val="top"/>
           </w:tcPr>
           <w:p>
@@ -2861,7 +4679,7 @@
         </w:tc>
         <w:tc>
           <w:tcPr>
-            <w:tcW w:type="dxa" w:w="3456"/>
+            <w:tcW w:type="dxa" w:w="3552"/>
             <w:vAlign w:val="top"/>
           </w:tcPr>
           <w:p>
@@ -2877,7 +4695,7 @@
         </w:tc>
         <w:tc>
           <w:tcPr>
-            <w:tcW w:type="dxa" w:w="3456"/>
+            <w:tcW w:type="dxa" w:w="3552"/>
             <w:vAlign w:val="top"/>
           </w:tcPr>
           <w:p>
@@ -2893,9 +4711,12 @@
         </w:tc>
       </w:tr>
       <w:tr>
+        <w:trPr>
+          <w:cantSplit/>
+        </w:trPr>
         <w:tc>
           <w:tcPr>
-            <w:tcW w:type="dxa" w:w="3456"/>
+            <w:tcW w:type="dxa" w:w="3552"/>
             <w:vAlign w:val="top"/>
           </w:tcPr>
           <w:p>
@@ -2911,7 +4732,7 @@
         </w:tc>
         <w:tc>
           <w:tcPr>
-            <w:tcW w:type="dxa" w:w="3456"/>
+            <w:tcW w:type="dxa" w:w="3552"/>
             <w:vAlign w:val="top"/>
           </w:tcPr>
           <w:p>
@@ -2927,7 +4748,7 @@
         </w:tc>
         <w:tc>
           <w:tcPr>
-            <w:tcW w:type="dxa" w:w="3456"/>
+            <w:tcW w:type="dxa" w:w="3552"/>
             <w:vAlign w:val="top"/>
           </w:tcPr>
           <w:p>
@@ -2943,9 +4764,12 @@
         </w:tc>
       </w:tr>
       <w:tr>
+        <w:trPr>
+          <w:cantSplit/>
+        </w:trPr>
         <w:tc>
           <w:tcPr>
-            <w:tcW w:type="dxa" w:w="3456"/>
+            <w:tcW w:type="dxa" w:w="3552"/>
             <w:vAlign w:val="top"/>
           </w:tcPr>
           <w:p>
@@ -2961,7 +4785,7 @@
         </w:tc>
         <w:tc>
           <w:tcPr>
-            <w:tcW w:type="dxa" w:w="3456"/>
+            <w:tcW w:type="dxa" w:w="3552"/>
             <w:vAlign w:val="top"/>
           </w:tcPr>
           <w:p>
@@ -2977,7 +4801,7 @@
         </w:tc>
         <w:tc>
           <w:tcPr>
-            <w:tcW w:type="dxa" w:w="3456"/>
+            <w:tcW w:type="dxa" w:w="3552"/>
             <w:vAlign w:val="top"/>
           </w:tcPr>
           <w:p>
@@ -2993,12 +4817,18 @@
         </w:tc>
       </w:tr>
       <w:tr>
+        <w:trPr>
+          <w:cantSplit/>
+        </w:trPr>
         <w:tc>
           <w:tcPr>
-            <w:tcW w:type="dxa" w:w="3456"/>
+            <w:tcW w:type="dxa" w:w="3552"/>
             <w:vAlign w:val="top"/>
           </w:tcPr>
           <w:p>
+            <w:pPr>
+              <w:keepNext/>
+            </w:pPr>
             <w:r/>
             <w:r>
               <w:rPr>
@@ -3011,10 +4841,13 @@
         </w:tc>
         <w:tc>
           <w:tcPr>
-            <w:tcW w:type="dxa" w:w="3456"/>
+            <w:tcW w:type="dxa" w:w="3552"/>
             <w:vAlign w:val="top"/>
           </w:tcPr>
           <w:p>
+            <w:pPr>
+              <w:keepNext/>
+            </w:pPr>
             <w:r/>
             <w:r>
               <w:rPr>
@@ -3027,10 +4860,13 @@
         </w:tc>
         <w:tc>
           <w:tcPr>
-            <w:tcW w:type="dxa" w:w="3456"/>
+            <w:tcW w:type="dxa" w:w="3552"/>
             <w:vAlign w:val="top"/>
           </w:tcPr>
           <w:p>
+            <w:pPr>
+              <w:keepNext/>
+            </w:pPr>
             <w:r/>
             <w:r>
               <w:rPr>
@@ -3043,9 +4879,12 @@
         </w:tc>
       </w:tr>
       <w:tr>
+        <w:trPr>
+          <w:cantSplit/>
+        </w:trPr>
         <w:tc>
           <w:tcPr>
-            <w:tcW w:type="dxa" w:w="3456"/>
+            <w:tcW w:type="dxa" w:w="3552"/>
             <w:vAlign w:val="top"/>
           </w:tcPr>
           <w:p>
@@ -3061,7 +4900,7 @@
         </w:tc>
         <w:tc>
           <w:tcPr>
-            <w:tcW w:type="dxa" w:w="3456"/>
+            <w:tcW w:type="dxa" w:w="3552"/>
             <w:vAlign w:val="top"/>
           </w:tcPr>
           <w:p>
@@ -3077,7 +4916,7 @@
         </w:tc>
         <w:tc>
           <w:tcPr>
-            <w:tcW w:type="dxa" w:w="3456"/>
+            <w:tcW w:type="dxa" w:w="3552"/>
             <w:vAlign w:val="top"/>
           </w:tcPr>
           <w:p>
@@ -3115,16 +4954,17 @@
         <w:tblLook w:firstColumn="1" w:firstRow="1" w:lastColumn="0" w:lastRow="0" w:noHBand="0" w:noVBand="1" w:val="04A0"/>
       </w:tblPr>
       <w:tblGrid>
-        <w:gridCol w:w="5184"/>
-        <w:gridCol w:w="5184"/>
+        <w:gridCol w:w="5328"/>
+        <w:gridCol w:w="5328"/>
       </w:tblGrid>
       <w:tr>
         <w:trPr>
           <w:tblHeader w:val="true"/>
+          <w:cantSplit/>
         </w:trPr>
         <w:tc>
           <w:tcPr>
-            <w:tcW w:type="dxa" w:w="5184"/>
+            <w:tcW w:type="dxa" w:w="5328"/>
             <w:vAlign w:val="top"/>
             <w:shd w:fill="D9EAF7"/>
           </w:tcPr>
@@ -3141,7 +4981,7 @@
         </w:tc>
         <w:tc>
           <w:tcPr>
-            <w:tcW w:type="dxa" w:w="5184"/>
+            <w:tcW w:type="dxa" w:w="5328"/>
             <w:vAlign w:val="top"/>
             <w:shd w:fill="D9EAF7"/>
           </w:tcPr>
@@ -3158,9 +4998,12 @@
         </w:tc>
       </w:tr>
       <w:tr>
+        <w:trPr>
+          <w:cantSplit/>
+        </w:trPr>
         <w:tc>
           <w:tcPr>
-            <w:tcW w:type="dxa" w:w="5184"/>
+            <w:tcW w:type="dxa" w:w="5328"/>
             <w:vAlign w:val="top"/>
           </w:tcPr>
           <w:p>
@@ -3176,7 +5019,7 @@
         </w:tc>
         <w:tc>
           <w:tcPr>
-            <w:tcW w:type="dxa" w:w="5184"/>
+            <w:tcW w:type="dxa" w:w="5328"/>
             <w:vAlign w:val="top"/>
           </w:tcPr>
           <w:p>
@@ -3192,9 +5035,12 @@
         </w:tc>
       </w:tr>
       <w:tr>
+        <w:trPr>
+          <w:cantSplit/>
+        </w:trPr>
         <w:tc>
           <w:tcPr>
-            <w:tcW w:type="dxa" w:w="5184"/>
+            <w:tcW w:type="dxa" w:w="5328"/>
             <w:vAlign w:val="top"/>
           </w:tcPr>
           <w:p>
@@ -3210,7 +5056,7 @@
         </w:tc>
         <w:tc>
           <w:tcPr>
-            <w:tcW w:type="dxa" w:w="5184"/>
+            <w:tcW w:type="dxa" w:w="5328"/>
             <w:vAlign w:val="top"/>
           </w:tcPr>
           <w:p>
@@ -3220,15 +5066,18 @@
                 <w:b w:val="0"/>
                 <w:sz w:val="17"/>
               </w:rPr>
-              <w:t>The GitHub production base docker-compose.yml does not define an OVOS service. OVOS-EnMS is documented as a separate source repository and as an embedded component in the full-stack release archive.</w:t>
+              <w:t>The GitHub production base docker-compose.yml does not define an OVOS service. OVOS-EnMS is documented as a separate source repository and companion assistant runtime.</w:t>
             </w:r>
           </w:p>
         </w:tc>
       </w:tr>
       <w:tr>
+        <w:trPr>
+          <w:cantSplit/>
+        </w:trPr>
         <w:tc>
           <w:tcPr>
-            <w:tcW w:type="dxa" w:w="5184"/>
+            <w:tcW w:type="dxa" w:w="5328"/>
             <w:vAlign w:val="top"/>
           </w:tcPr>
           <w:p>
@@ -3238,13 +5087,13 @@
                 <w:b w:val="0"/>
                 <w:sz w:val="17"/>
               </w:rPr>
-              <w:t>OVOS release artifact</w:t>
+              <w:t>OVOS optional LLM fallback</w:t>
             </w:r>
           </w:p>
         </w:tc>
         <w:tc>
           <w:tcPr>
-            <w:tcW w:type="dxa" w:w="5184"/>
+            <w:tcW w:type="dxa" w:w="5328"/>
             <w:vAlign w:val="top"/>
           </w:tcPr>
           <w:p>
@@ -3254,15 +5103,18 @@
                 <w:b w:val="0"/>
                 <w:sz w:val="17"/>
               </w:rPr>
-              <w:t>Release notes state optional GGUF model weights are not bundled by default.</w:t>
+              <w:t>The OVOS-EnMS Dockerfile installs LLM fallback dependencies only when INSTALL_LLM_FALLBACK=true. Model availability must be verified in the OVOS-EnMS repository/runtime.</w:t>
             </w:r>
           </w:p>
         </w:tc>
       </w:tr>
       <w:tr>
+        <w:trPr>
+          <w:cantSplit/>
+        </w:trPr>
         <w:tc>
           <w:tcPr>
-            <w:tcW w:type="dxa" w:w="5184"/>
+            <w:tcW w:type="dxa" w:w="5328"/>
             <w:vAlign w:val="top"/>
           </w:tcPr>
           <w:p>
@@ -3278,7 +5130,7 @@
         </w:tc>
         <w:tc>
           <w:tcPr>
-            <w:tcW w:type="dxa" w:w="5184"/>
+            <w:tcW w:type="dxa" w:w="5328"/>
             <w:vAlign w:val="top"/>
           </w:tcPr>
           <w:p>
@@ -3294,9 +5146,12 @@
         </w:tc>
       </w:tr>
       <w:tr>
+        <w:trPr>
+          <w:cantSplit/>
+        </w:trPr>
         <w:tc>
           <w:tcPr>
-            <w:tcW w:type="dxa" w:w="5184"/>
+            <w:tcW w:type="dxa" w:w="5328"/>
             <w:vAlign w:val="top"/>
           </w:tcPr>
           <w:p>
@@ -3312,7 +5167,7 @@
         </w:tc>
         <w:tc>
           <w:tcPr>
-            <w:tcW w:type="dxa" w:w="5184"/>
+            <w:tcW w:type="dxa" w:w="5328"/>
             <w:vAlign w:val="top"/>
           </w:tcPr>
           <w:p>
@@ -3328,12 +5183,18 @@
         </w:tc>
       </w:tr>
       <w:tr>
+        <w:trPr>
+          <w:cantSplit/>
+        </w:trPr>
         <w:tc>
           <w:tcPr>
-            <w:tcW w:type="dxa" w:w="5184"/>
+            <w:tcW w:type="dxa" w:w="5328"/>
             <w:vAlign w:val="top"/>
           </w:tcPr>
           <w:p>
+            <w:pPr>
+              <w:keepNext/>
+            </w:pPr>
             <w:r/>
             <w:r>
               <w:rPr>
@@ -3346,10 +5207,13 @@
         </w:tc>
         <w:tc>
           <w:tcPr>
-            <w:tcW w:type="dxa" w:w="5184"/>
+            <w:tcW w:type="dxa" w:w="5328"/>
             <w:vAlign w:val="top"/>
           </w:tcPr>
           <w:p>
+            <w:pPr>
+              <w:keepNext/>
+            </w:pPr>
             <w:r/>
             <w:r>
               <w:rPr>
@@ -3362,9 +5226,12 @@
         </w:tc>
       </w:tr>
       <w:tr>
+        <w:trPr>
+          <w:cantSplit/>
+        </w:trPr>
         <w:tc>
           <w:tcPr>
-            <w:tcW w:type="dxa" w:w="5184"/>
+            <w:tcW w:type="dxa" w:w="5328"/>
             <w:vAlign w:val="top"/>
           </w:tcPr>
           <w:p>
@@ -3380,7 +5247,7 @@
         </w:tc>
         <w:tc>
           <w:tcPr>
-            <w:tcW w:type="dxa" w:w="5184"/>
+            <w:tcW w:type="dxa" w:w="5328"/>
             <w:vAlign w:val="top"/>
           </w:tcPr>
           <w:p>
@@ -3402,12 +5269,12 @@
         <w:pStyle w:val="Heading1"/>
       </w:pPr>
       <w:r>
-        <w:t>Evidence References</w:t>
+        <w:t>Source References</w:t>
       </w:r>
     </w:p>
     <w:p>
       <w:r>
-        <w:t>The table below lists the main local evidence used for this document. It is not a full file inventory; it identifies the sources behind the material claims.</w:t>
+        <w:t>The table below lists the main source material used for this document. It is not a full file inventory; it identifies the sources behind the material claims.</w:t>
       </w:r>
     </w:p>
     <w:tbl>
@@ -3418,16 +5285,17 @@
         <w:tblLook w:firstColumn="1" w:firstRow="1" w:lastColumn="0" w:lastRow="0" w:noHBand="0" w:noVBand="1" w:val="04A0"/>
       </w:tblPr>
       <w:tblGrid>
-        <w:gridCol w:w="5184"/>
-        <w:gridCol w:w="5184"/>
+        <w:gridCol w:w="5328"/>
+        <w:gridCol w:w="5328"/>
       </w:tblGrid>
       <w:tr>
         <w:trPr>
           <w:tblHeader w:val="true"/>
+          <w:cantSplit/>
         </w:trPr>
         <w:tc>
           <w:tcPr>
-            <w:tcW w:type="dxa" w:w="5184"/>
+            <w:tcW w:type="dxa" w:w="5328"/>
             <w:vAlign w:val="top"/>
             <w:shd w:fill="D9EAF7"/>
           </w:tcPr>
@@ -3444,7 +5312,7 @@
         </w:tc>
         <w:tc>
           <w:tcPr>
-            <w:tcW w:type="dxa" w:w="5184"/>
+            <w:tcW w:type="dxa" w:w="5328"/>
             <w:vAlign w:val="top"/>
             <w:shd w:fill="D9EAF7"/>
           </w:tcPr>
@@ -3455,15 +5323,18 @@
                 <w:b/>
                 <w:sz w:val="17"/>
               </w:rPr>
-              <w:t>Evidence</w:t>
+              <w:t>Source material</w:t>
             </w:r>
           </w:p>
         </w:tc>
       </w:tr>
       <w:tr>
+        <w:trPr>
+          <w:cantSplit/>
+        </w:trPr>
         <w:tc>
           <w:tcPr>
-            <w:tcW w:type="dxa" w:w="5184"/>
+            <w:tcW w:type="dxa" w:w="5328"/>
             <w:vAlign w:val="top"/>
           </w:tcPr>
           <w:p>
@@ -3479,7 +5350,7 @@
         </w:tc>
         <w:tc>
           <w:tcPr>
-            <w:tcW w:type="dxa" w:w="5184"/>
+            <w:tcW w:type="dxa" w:w="5328"/>
             <w:vAlign w:val="top"/>
           </w:tcPr>
           <w:p>
@@ -3495,9 +5366,12 @@
         </w:tc>
       </w:tr>
       <w:tr>
+        <w:trPr>
+          <w:cantSplit/>
+        </w:trPr>
         <w:tc>
           <w:tcPr>
-            <w:tcW w:type="dxa" w:w="5184"/>
+            <w:tcW w:type="dxa" w:w="5328"/>
             <w:vAlign w:val="top"/>
           </w:tcPr>
           <w:p>
@@ -3513,7 +5387,7 @@
         </w:tc>
         <w:tc>
           <w:tcPr>
-            <w:tcW w:type="dxa" w:w="5184"/>
+            <w:tcW w:type="dxa" w:w="5328"/>
             <w:vAlign w:val="top"/>
           </w:tcPr>
           <w:p>
@@ -3529,9 +5403,12 @@
         </w:tc>
       </w:tr>
       <w:tr>
+        <w:trPr>
+          <w:cantSplit/>
+        </w:trPr>
         <w:tc>
           <w:tcPr>
-            <w:tcW w:type="dxa" w:w="5184"/>
+            <w:tcW w:type="dxa" w:w="5328"/>
             <w:vAlign w:val="top"/>
           </w:tcPr>
           <w:p>
@@ -3547,7 +5424,7 @@
         </w:tc>
         <w:tc>
           <w:tcPr>
-            <w:tcW w:type="dxa" w:w="5184"/>
+            <w:tcW w:type="dxa" w:w="5328"/>
             <w:vAlign w:val="top"/>
           </w:tcPr>
           <w:p>
@@ -3563,9 +5440,12 @@
         </w:tc>
       </w:tr>
       <w:tr>
+        <w:trPr>
+          <w:cantSplit/>
+        </w:trPr>
         <w:tc>
           <w:tcPr>
-            <w:tcW w:type="dxa" w:w="5184"/>
+            <w:tcW w:type="dxa" w:w="5328"/>
             <w:vAlign w:val="top"/>
           </w:tcPr>
           <w:p>
@@ -3581,7 +5461,7 @@
         </w:tc>
         <w:tc>
           <w:tcPr>
-            <w:tcW w:type="dxa" w:w="5184"/>
+            <w:tcW w:type="dxa" w:w="5328"/>
             <w:vAlign w:val="top"/>
           </w:tcPr>
           <w:p>
@@ -3597,9 +5477,12 @@
         </w:tc>
       </w:tr>
       <w:tr>
+        <w:trPr>
+          <w:cantSplit/>
+        </w:trPr>
         <w:tc>
           <w:tcPr>
-            <w:tcW w:type="dxa" w:w="5184"/>
+            <w:tcW w:type="dxa" w:w="5328"/>
             <w:vAlign w:val="top"/>
           </w:tcPr>
           <w:p>
@@ -3615,7 +5498,7 @@
         </w:tc>
         <w:tc>
           <w:tcPr>
-            <w:tcW w:type="dxa" w:w="5184"/>
+            <w:tcW w:type="dxa" w:w="5328"/>
             <w:vAlign w:val="top"/>
           </w:tcPr>
           <w:p>
@@ -3631,12 +5514,18 @@
         </w:tc>
       </w:tr>
       <w:tr>
+        <w:trPr>
+          <w:cantSplit/>
+        </w:trPr>
         <w:tc>
           <w:tcPr>
-            <w:tcW w:type="dxa" w:w="5184"/>
+            <w:tcW w:type="dxa" w:w="5328"/>
             <w:vAlign w:val="top"/>
           </w:tcPr>
           <w:p>
+            <w:pPr>
+              <w:keepNext/>
+            </w:pPr>
             <w:r/>
             <w:r>
               <w:rPr>
@@ -3649,10 +5538,13 @@
         </w:tc>
         <w:tc>
           <w:tcPr>
-            <w:tcW w:type="dxa" w:w="5184"/>
+            <w:tcW w:type="dxa" w:w="5328"/>
             <w:vAlign w:val="top"/>
           </w:tcPr>
           <w:p>
+            <w:pPr>
+              <w:keepNext/>
+            </w:pPr>
             <w:r/>
             <w:r>
               <w:rPr>
@@ -3665,9 +5557,12 @@
         </w:tc>
       </w:tr>
       <w:tr>
+        <w:trPr>
+          <w:cantSplit/>
+        </w:trPr>
         <w:tc>
           <w:tcPr>
-            <w:tcW w:type="dxa" w:w="5184"/>
+            <w:tcW w:type="dxa" w:w="5328"/>
             <w:vAlign w:val="top"/>
           </w:tcPr>
           <w:p>
@@ -3683,7 +5578,7 @@
         </w:tc>
         <w:tc>
           <w:tcPr>
-            <w:tcW w:type="dxa" w:w="5184"/>
+            <w:tcW w:type="dxa" w:w="5328"/>
             <w:vAlign w:val="top"/>
           </w:tcPr>
           <w:p>
@@ -3703,7 +5598,7 @@
     <w:sectPr>
       <w:footerReference w:type="default" r:id="rId10"/>
       <w:pgSz w:w="12240" w:h="15840"/>
-      <w:pgMar w:top="936" w:right="936" w:bottom="936" w:left="936" w:header="720" w:footer="720" w:gutter="0"/>
+      <w:pgMar w:top="864" w:right="792" w:bottom="864" w:left="792" w:header="720" w:footer="720" w:gutter="0"/>
       <w:cols w:space="720"/>
       <w:docGrid w:linePitch="360"/>
     </w:sectPr>
@@ -3723,7 +5618,7 @@
         <w:color w:val="64748B"/>
         <w:sz w:val="16"/>
       </w:rPr>
-      <w:t>WASABI / HumanEnerDIA / OVOS-EnMS | Energy Management System Reports and KPI Reports | Version 1.0 | 2026-06-08</w:t>
+      <w:t>WASABI / HumanEnerDIA / OVOS-EnMS | Energy Management System Reports and KPI Reports | Version 1.1 | 2026-06-09</w:t>
     </w:r>
   </w:p>
 </w:ftr>

</xml_diff>